<commit_message>
Use the supplied reference and README conventions
</commit_message>
<xml_diff>
--- a/report.docx
+++ b/report.docx
@@ -155,25 +155,13 @@
           <w:iCs/>
           <w:i/>
         </w:rPr>
-        <w:t xml:space="preserve">Reference and draw order.</w:t>
-      </w:r>
-      <w:r>
-        <w:t xml:space="preserve"> </w:t>
-      </w:r>
-      <w:r>
-        <w:t xml:space="preserve">The assignment refers to a supplied</w:t>
-      </w:r>
-      <w:r>
-        <w:t xml:space="preserve"> </w:t>
-      </w:r>
-      <w:r>
-        <w:rPr>
-          <w:rStyle w:val="VerbatimChar"/>
-        </w:rPr>
-        <w:t xml:space="preserve">reference_solver.py</w:t>
-      </w:r>
-      <w:r>
-        <w:t xml:space="preserve">,</w:t>
+        <w:t xml:space="preserve">Conventions.</w:t>
+      </w:r>
+      <w:r>
+        <w:t xml:space="preserve"> </w:t>
+      </w:r>
+      <w:r>
+        <w:t xml:space="preserve">All reference values and boundaries are the supplied</w:t>
       </w:r>
       <w:r>
         <w:t xml:space="preserve"> </w:t>
@@ -188,7 +176,7 @@
         <w:t xml:space="preserve"> </w:t>
       </w:r>
       <w:r>
-        <w:t xml:space="preserve">and</w:t>
+        <w:t xml:space="preserve">arrays (preserved unchanged), and every random draw follows the supplied</w:t>
       </w:r>
       <w:r>
         <w:t xml:space="preserve"> </w:t>
@@ -200,64 +188,10 @@
         <w:t xml:space="preserve">README.md</w:t>
       </w:r>
       <w:r>
-        <w:t xml:space="preserve">. We did not receive these, so the numerical reference is our own independently validated grid solver (Section 2), and the random-draw order is our own documented choice. Both are isolated in</w:t>
-      </w:r>
-      <w:r>
-        <w:t xml:space="preserve"> </w:t>
-      </w:r>
-      <w:r>
-        <w:rPr>
-          <w:rStyle w:val="VerbatimChar"/>
-        </w:rPr>
-        <w:t xml:space="preserve">reference.py</w:t>
-      </w:r>
-      <w:r>
-        <w:t xml:space="preserve"> </w:t>
-      </w:r>
-      <w:r>
-        <w:t xml:space="preserve">and</w:t>
-      </w:r>
-      <w:r>
-        <w:t xml:space="preserve"> </w:t>
-      </w:r>
-      <w:r>
-        <w:rPr>
-          <w:rStyle w:val="VerbatimChar"/>
-        </w:rPr>
-        <w:t xml:space="preserve">simulation.py</w:t>
-      </w:r>
-      <w:r>
-        <w:t xml:space="preserve"> </w:t>
-      </w:r>
-      <w:r>
-        <w:t xml:space="preserve">/</w:t>
-      </w:r>
-      <w:r>
-        <w:t xml:space="preserve"> </w:t>
-      </w:r>
-      <w:r>
-        <w:rPr>
-          <w:rStyle w:val="VerbatimChar"/>
-        </w:rPr>
-        <w:t xml:space="preserve">nn_policy.py</w:t>
-      </w:r>
-      <w:r>
-        <w:t xml:space="preserve">, so the supplied versions can be substituted and</w:t>
-      </w:r>
-      <w:r>
-        <w:t xml:space="preserve"> </w:t>
-      </w:r>
-      <w:r>
-        <w:rPr>
-          <w:rStyle w:val="VerbatimChar"/>
-        </w:rPr>
-        <w:t xml:space="preserve">python run_all.py</w:t>
-      </w:r>
-      <w:r>
-        <w:t xml:space="preserve"> </w:t>
-      </w:r>
-      <w:r>
-        <w:t xml:space="preserve">rerun.</w:t>
+        <w:t xml:space="preserve"> </w:t>
+      </w:r>
+      <w:r>
+        <w:t xml:space="preserve">conventions. Our own independent solver is used only for the Part 1 illustrations and as a cross-check (Section 2).</w:t>
       </w:r>
     </w:p>
     <w:bookmarkStart w:id="20" w:name="the-exercise-boundary"/>
@@ -1686,7 +1620,7 @@
         </m:r>
       </m:oMath>
       <w:r>
-        <w:t xml:space="preserve">. Our solver satisfies the lower bound at every node.</w:t>
+        <w:t xml:space="preserve">. The reference satisfies the lower bound at every node.</w:t>
       </w:r>
     </w:p>
     <w:p>
@@ -1886,7 +1820,7 @@
         </m:d>
       </m:oMath>
       <w:r>
-        <w:t xml:space="preserve">. That is about 9 days at</w:t>
+        <w:t xml:space="preserve">: about 9 days at</w:t>
       </w:r>
       <w:r>
         <w:t xml:space="preserve"> </w:t>
@@ -1909,7 +1843,7 @@
         <w:t xml:space="preserve"> </w:t>
       </w:r>
       <w:r>
-        <w:t xml:space="preserve">and about 75 days at</w:t>
+        <w:t xml:space="preserve">and 75 days at</w:t>
       </w:r>
       <w:r>
         <w:t xml:space="preserve"> </w:t>
@@ -1927,74 +1861,6 @@
         <m:r>
           <m:t>80</m:t>
         </m:r>
-      </m:oMath>
-      <w:r>
-        <w:t xml:space="preserve">. The bound makes this precise because it compares</w:t>
-      </w:r>
-      <w:r>
-        <w:t xml:space="preserve"> </w:t>
-      </w:r>
-      <m:oMath>
-        <m:r>
-          <m:t>δ</m:t>
-        </m:r>
-        <m:r>
-          <m:t>s</m:t>
-        </m:r>
-      </m:oMath>
-      <w:r>
-        <w:t xml:space="preserve"> </w:t>
-      </w:r>
-      <w:r>
-        <w:t xml:space="preserve">directly with</w:t>
-      </w:r>
-      <w:r>
-        <w:t xml:space="preserve"> </w:t>
-      </w:r>
-      <m:oMath>
-        <m:r>
-          <m:t>K</m:t>
-        </m:r>
-        <m:d>
-          <m:dPr>
-            <m:begChr m:val="("/>
-            <m:endChr m:val=")"/>
-            <m:sepChr m:val=""/>
-            <m:grow/>
-          </m:dPr>
-          <m:e>
-            <m:r>
-              <m:t>1</m:t>
-            </m:r>
-            <m:r>
-              <m:rPr>
-                <m:sty m:val="p"/>
-              </m:rPr>
-              <m:t>−</m:t>
-            </m:r>
-            <m:sSup>
-              <m:e>
-                <m:r>
-                  <m:t>e</m:t>
-                </m:r>
-              </m:e>
-              <m:sup>
-                <m:r>
-                  <m:rPr>
-                    <m:sty m:val="p"/>
-                  </m:rPr>
-                  <m:t>−</m:t>
-                </m:r>
-                <m:r>
-                  <m:t>r</m:t>
-                </m:r>
-                <m:r>
-                  <m:t>ε</m:t>
-                </m:r>
-              </m:sup>
-            </m:sSup>
-          </m:e>
-        </m:d>
       </m:oMath>
       <w:r>
         <w:t xml:space="preserve">.</w:t>
@@ -2166,7 +2032,7 @@
         </m:r>
       </m:oMath>
       <w:r>
-        <w:t xml:space="preserve">. In fact the computed boundary lies</w:t>
+        <w:t xml:space="preserve">. In fact the reference boundary lies</w:t>
       </w:r>
       <w:r>
         <w:t xml:space="preserve"> </w:t>
@@ -3189,7 +3055,7 @@
         <w:pStyle w:val="BodyText"/>
       </w:pPr>
       <w:r>
-        <w:t xml:space="preserve">A coupled simulation shows why the common</w:t>
+        <w:t xml:space="preserve">In a coupled simulation, one common</w:t>
       </w:r>
       <w:r>
         <w:t xml:space="preserve"> </w:t>
@@ -3203,21 +3069,7 @@
         <w:t xml:space="preserve"> </w:t>
       </w:r>
       <w:r>
-        <w:t xml:space="preserve">matters. With one</w:t>
-      </w:r>
-      <w:r>
-        <w:t xml:space="preserve"> </w:t>
-      </w:r>
-      <m:oMath>
-        <m:r>
-          <m:t>τ</m:t>
-        </m:r>
-      </m:oMath>
-      <w:r>
-        <w:t xml:space="preserve"> </w:t>
-      </w:r>
-      <w:r>
-        <w:t xml:space="preserve">no path violates dominance. When each model uses its own threshold rule, 12.4% of paths do.</w:t>
+        <w:t xml:space="preserve">gives no violations, but model-specific threshold rules violate dominance on 12.4% of paths.</w:t>
       </w:r>
     </w:p>
     <w:p>
@@ -3800,7 +3652,7 @@
               <w:jc w:val="left"/>
             </w:pPr>
             <w:r>
-              <w:t xml:space="preserve">0.200</w:t>
+              <w:t xml:space="preserve">0.066</w:t>
             </w:r>
           </w:p>
         </w:tc>
@@ -3838,31 +3690,31 @@
               <w:jc w:val="left"/>
             </w:pPr>
             <w:r>
-              <w:t xml:space="preserve">32</w:t>
-            </w:r>
-          </w:p>
-        </w:tc>
-        <w:tc>
-          <w:tcPr/>
-          <w:p>
-            <w:pPr>
-              <w:pStyle w:val="Compact"/>
-              <w:jc w:val="left"/>
-            </w:pPr>
-            <w:r>
-              <w:t xml:space="preserve">0.134</w:t>
-            </w:r>
-          </w:p>
-        </w:tc>
-        <w:tc>
-          <w:tcPr/>
-          <w:p>
-            <w:pPr>
-              <w:pStyle w:val="Compact"/>
-              <w:jc w:val="left"/>
-            </w:pPr>
-            <w:r>
-              <w:t xml:space="preserve">0.151</w:t>
+              <w:t xml:space="preserve">21</w:t>
+            </w:r>
+          </w:p>
+        </w:tc>
+        <w:tc>
+          <w:tcPr/>
+          <w:p>
+            <w:pPr>
+              <w:pStyle w:val="Compact"/>
+              <w:jc w:val="left"/>
+            </w:pPr>
+            <w:r>
+              <w:t xml:space="preserve">0.051</w:t>
+            </w:r>
+          </w:p>
+        </w:tc>
+        <w:tc>
+          <w:tcPr/>
+          <w:p>
+            <w:pPr>
+              <w:pStyle w:val="Compact"/>
+              <w:jc w:val="left"/>
+            </w:pPr>
+            <w:r>
+              <w:t xml:space="preserve">0.082</w:t>
             </w:r>
           </w:p>
         </w:tc>
@@ -3986,7 +3838,7 @@
               <w:jc w:val="left"/>
             </w:pPr>
             <w:r>
-              <w:t xml:space="preserve">0.103</w:t>
+              <w:t xml:space="preserve">0.094</w:t>
             </w:r>
           </w:p>
         </w:tc>
@@ -4024,31 +3876,31 @@
               <w:jc w:val="left"/>
             </w:pPr>
             <w:r>
-              <w:t xml:space="preserve">0</w:t>
-            </w:r>
-          </w:p>
-        </w:tc>
-        <w:tc>
-          <w:tcPr/>
-          <w:p>
-            <w:pPr>
-              <w:pStyle w:val="Compact"/>
-              <w:jc w:val="left"/>
-            </w:pPr>
-            <w:r>
-              <w:t xml:space="preserve">0.000</w:t>
-            </w:r>
-          </w:p>
-        </w:tc>
-        <w:tc>
-          <w:tcPr/>
-          <w:p>
-            <w:pPr>
-              <w:pStyle w:val="Compact"/>
-              <w:jc w:val="left"/>
-            </w:pPr>
-            <w:r>
-              <w:t xml:space="preserve">0.056</w:t>
+              <w:t xml:space="preserve">36</w:t>
+            </w:r>
+          </w:p>
+        </w:tc>
+        <w:tc>
+          <w:tcPr/>
+          <w:p>
+            <w:pPr>
+              <w:pStyle w:val="Compact"/>
+              <w:jc w:val="left"/>
+            </w:pPr>
+            <w:r>
+              <w:t xml:space="preserve">0.051</w:t>
+            </w:r>
+          </w:p>
+        </w:tc>
+        <w:tc>
+          <w:tcPr/>
+          <w:p>
+            <w:pPr>
+              <w:pStyle w:val="Compact"/>
+              <w:jc w:val="left"/>
+            </w:pPr>
+            <w:r>
+              <w:t xml:space="preserve">0.172</w:t>
             </w:r>
           </w:p>
         </w:tc>
@@ -4309,10 +4161,7 @@
         <w:pStyle w:val="Compact"/>
       </w:pPr>
       <w:r>
-        <w:t xml:space="preserve">The NN violations at</w:t>
-      </w:r>
-      <w:r>
-        <w:t xml:space="preserve"> </w:t>
+        <w:t xml:space="preserve">The NN violates the ordering on 21 dates (</w:t>
       </w:r>
       <m:oMath>
         <m:r>
@@ -4329,14 +4178,11 @@
         </m:r>
       </m:oMath>
       <w:r>
-        <w:t xml:space="preserve"> </w:t>
-      </w:r>
-      <w:r>
-        <w:t xml:space="preserve">(</w:t>
-      </w:r>
-      <m:oMath>
-        <m:r>
-          <m:t>A</m:t>
+        <w:t xml:space="preserve">) and 36 dates (</w:t>
+      </w:r>
+      <m:oMath>
+        <m:r>
+          <m:t>N</m:t>
         </m:r>
         <m:r>
           <m:rPr>
@@ -4345,28 +4191,122 @@
           <m:t>=</m:t>
         </m:r>
         <m:r>
-          <m:t>32</m:t>
-        </m:r>
-      </m:oMath>
-      <w:r>
-        <w:t xml:space="preserve">) come from case 0. Its selected checkpoint let the early-date boundary drift down to about</w:t>
-      </w:r>
-      <w:r>
-        <w:t xml:space="preserve"> </w:t>
-      </w:r>
-      <m:oMath>
-        <m:r>
-          <m:t>0.49</m:t>
+          <m:t>360</m:t>
+        </m:r>
+      </m:oMath>
+      <w:r>
+        <w:t xml:space="preserve">), by at most</w:t>
+      </w:r>
+      <w:r>
+        <w:t xml:space="preserve"> </w:t>
+      </w:r>
+      <m:oMath>
+        <m:r>
+          <m:t>B</m:t>
+        </m:r>
+        <m:r>
+          <m:rPr>
+            <m:sty m:val="p"/>
+          </m:rPr>
+          <m:t>=</m:t>
+        </m:r>
+      </m:oMath>
+      <w:r>
+        <w:t xml:space="preserve"> </w:t>
+      </w:r>
+      <w:r>
+        <w:t xml:space="preserve">0.051. All violations lie just after</w:t>
+      </w:r>
+      <w:r>
+        <w:t xml:space="preserve"> </w:t>
+      </w:r>
+      <m:oMath>
+        <m:sSub>
+          <m:e>
+            <m:r>
+              <m:t>d</m:t>
+            </m:r>
+          </m:e>
+          <m:sub>
+            <m:r>
+              <m:t>1</m:t>
+            </m:r>
+          </m:sub>
+        </m:sSub>
+      </m:oMath>
+      <w:r>
+        <w:t xml:space="preserve"> </w:t>
+      </w:r>
+      <w:r>
+        <w:t xml:space="preserve">and</w:t>
+      </w:r>
+      <w:r>
+        <w:t xml:space="preserve"> </w:t>
+      </w:r>
+      <m:oMath>
+        <m:sSub>
+          <m:e>
+            <m:r>
+              <m:t>d</m:t>
+            </m:r>
+          </m:e>
+          <m:sub>
+            <m:r>
+              <m:t>2</m:t>
+            </m:r>
+          </m:sub>
+        </m:sSub>
+      </m:oMath>
+      <w:r>
+        <w:t xml:space="preserve">, where the</w:t>
+      </w:r>
+      <w:r>
+        <w:t xml:space="preserve"> </w:t>
+      </w:r>
+      <m:oMath>
+        <m:r>
+          <m:t>δ</m:t>
+        </m:r>
+      </m:oMath>
+      <w:r>
+        <w:t xml:space="preserve">-network overshoots the post-dividend boundary (by up to</w:t>
+      </w:r>
+      <w:r>
+        <w:t xml:space="preserve"> </w:t>
+      </w:r>
+      <m:oMath>
+        <m:r>
+          <m:t>0.08</m:t>
         </m:r>
         <m:r>
           <m:t>K</m:t>
         </m:r>
       </m:oMath>
       <w:r>
-        <w:t xml:space="preserve"> </w:t>
-      </w:r>
-      <w:r>
-        <w:t xml:space="preserve">(Section 4).</w:t>
+        <w:t xml:space="preserve">, Fig. 1b) and so ends up above the</w:t>
+      </w:r>
+      <w:r>
+        <w:t xml:space="preserve"> </w:t>
+      </w:r>
+      <m:oMath>
+        <m:r>
+          <m:t>δ</m:t>
+        </m:r>
+        <m:r>
+          <m:rPr>
+            <m:sty m:val="p"/>
+          </m:rPr>
+          <m:t>=</m:t>
+        </m:r>
+        <m:r>
+          <m:t>0</m:t>
+        </m:r>
+      </m:oMath>
+      <w:r>
+        <w:t xml:space="preserve"> </w:t>
+      </w:r>
+      <w:r>
+        <w:t xml:space="preserve">network.</w:t>
       </w:r>
     </w:p>
     <w:bookmarkEnd w:id="20"/>
@@ -4394,173 +4334,22 @@
         <w:t xml:space="preserve"> </w:t>
       </w:r>
       <w:r>
-        <w:t xml:space="preserve">Our solver uses a uniform</w:t>
-      </w:r>
-      <w:r>
-        <w:t xml:space="preserve"> </w:t>
-      </w:r>
-      <m:oMath>
-        <m:r>
-          <m:rPr>
-            <m:sty m:val="p"/>
-          </m:rPr>
-          <m:t>log</m:t>
-        </m:r>
-        <m:r>
-          <m:t>S</m:t>
-        </m:r>
-      </m:oMath>
-      <w:r>
-        <w:t xml:space="preserve"> </w:t>
-      </w:r>
-      <w:r>
-        <w:t xml:space="preserve">grid with</w:t>
-      </w:r>
-      <w:r>
-        <w:t xml:space="preserve"> </w:t>
-      </w:r>
-      <m:oMath>
-        <m:r>
-          <m:t>S</m:t>
-        </m:r>
-        <m:r>
-          <m:rPr>
-            <m:sty m:val="p"/>
-          </m:rPr>
-          <m:t>=</m:t>
-        </m:r>
-        <m:r>
-          <m:t>K</m:t>
-        </m:r>
-      </m:oMath>
-      <w:r>
-        <w:t xml:space="preserve"> </w:t>
-      </w:r>
-      <w:r>
-        <w:t xml:space="preserve">on a node:</w:t>
-      </w:r>
-    </w:p>
-    <w:p>
-      <w:pPr>
-        <w:numPr>
-          <w:ilvl w:val="0"/>
-          <w:numId w:val="1002"/>
-        </w:numPr>
-        <w:pStyle w:val="Compact"/>
-      </w:pPr>
-      <w:r>
-        <w:t xml:space="preserve">The Gaussian step is integrated exactly for the piecewise-linear interpolant, with a</w:t>
-      </w:r>
-      <w:r>
-        <w:t xml:space="preserve"> </w:t>
-      </w:r>
-      <m:oMath>
-        <m:r>
-          <m:t>d</m:t>
-        </m:r>
-        <m:sSup>
-          <m:e>
-            <m:r>
-              <m:t>x</m:t>
-            </m:r>
-          </m:e>
-          <m:sup>
-            <m:r>
-              <m:t>2</m:t>
-            </m:r>
-          </m:sup>
-        </m:sSup>
-        <m:r>
-          <m:rPr>
-            <m:sty m:val="p"/>
-          </m:rPr>
-          <m:t>/</m:t>
-        </m:r>
-        <m:r>
-          <m:t>6</m:t>
-        </m:r>
-      </m:oMath>
-      <w:r>
-        <w:t xml:space="preserve"> </w:t>
-      </w:r>
-      <w:r>
-        <w:t xml:space="preserve">variance correction. Without it, the European error grew with</w:t>
-      </w:r>
-      <w:r>
-        <w:t xml:space="preserve"> </w:t>
-      </w:r>
-      <m:oMath>
-        <m:r>
-          <m:t>N</m:t>
-        </m:r>
-      </m:oMath>
-      <w:r>
-        <w:t xml:space="preserve">.</w:t>
-      </w:r>
-    </w:p>
-    <w:p>
-      <w:pPr>
-        <w:numPr>
-          <w:ilvl w:val="0"/>
-          <w:numId w:val="1002"/>
-        </w:numPr>
-        <w:pStyle w:val="Compact"/>
-      </w:pPr>
-      <w:r>
-        <w:t xml:space="preserve">The dividend is an exact shift of 10 grid nodes.</w:t>
-      </w:r>
-    </w:p>
-    <w:p>
-      <w:pPr>
-        <w:numPr>
-          <w:ilvl w:val="0"/>
-          <w:numId w:val="1002"/>
-        </w:numPr>
-        <w:pStyle w:val="Compact"/>
-      </w:pPr>
-      <w:r>
-        <w:t xml:space="preserve">European prices match the closed form to about</w:t>
-      </w:r>
-      <w:r>
-        <w:t xml:space="preserve"> </w:t>
-      </w:r>
-      <m:oMath>
-        <m:r>
-          <m:t>2</m:t>
-        </m:r>
-        <m:r>
-          <m:rPr>
-            <m:sty m:val="p"/>
-          </m:rPr>
-          <m:t>×</m:t>
-        </m:r>
-        <m:sSup>
-          <m:e>
-            <m:r>
-              <m:t>10</m:t>
-            </m:r>
-          </m:e>
-          <m:sup>
-            <m:r>
-              <m:rPr>
-                <m:sty m:val="p"/>
-              </m:rPr>
-              <m:t>−</m:t>
-            </m:r>
-            <m:r>
-              <m:t>5</m:t>
-            </m:r>
-          </m:sup>
-        </m:sSup>
-      </m:oMath>
-      <w:r>
-        <w:t xml:space="preserve">.</w:t>
+        <w:rPr>
+          <w:rStyle w:val="VerbatimChar"/>
+        </w:rPr>
+        <w:t xml:space="preserve">python reference_solver.py --verify</w:t>
+      </w:r>
+      <w:r>
+        <w:t xml:space="preserve"> </w:t>
+      </w:r>
+      <w:r>
+        <w:t xml:space="preserve">passed: the saved arrays match a recomputation, and the refinements change little.</w:t>
       </w:r>
     </w:p>
     <w:tbl>
       <w:tblPr>
         <w:tblStyle w:val="Table"/>
-        <w:tblW w:type="auto" w:w="0"/>
+        <w:tblW w:type="pct" w:w="5000"/>
         <w:tblLook w:firstRow="1" w:lastRow="0" w:firstColumn="0" w:lastColumn="0" w:noHBand="0" w:noVBand="0" w:val="0020"/>
         <w:jc w:val="start"/>
       </w:tblPr>
@@ -4581,187 +4370,148 @@
               <w:jc w:val="left"/>
             </w:pPr>
             <w:r>
-              <w:t xml:space="preserve">Change</w:t>
-            </w:r>
-          </w:p>
-        </w:tc>
-        <w:tc>
-          <w:tcPr/>
-          <w:p>
-            <w:pPr>
-              <w:pStyle w:val="Compact"/>
-              <w:jc w:val="left"/>
-            </w:pPr>
-            <w:r>
-              <w:t xml:space="preserve">Max price change ($)</w:t>
-            </w:r>
-          </w:p>
-        </w:tc>
-        <w:tc>
-          <w:tcPr/>
-          <w:p>
-            <w:pPr>
-              <w:pStyle w:val="Compact"/>
-              <w:jc w:val="left"/>
-            </w:pPr>
-            <w:r>
-              <w:t xml:space="preserve">Max boundary change ($)</w:t>
-            </w:r>
-          </w:p>
-        </w:tc>
-      </w:tr>
-      <w:tr>
-        <w:tc>
-          <w:tcPr/>
-          <w:p>
-            <w:pPr>
-              <w:pStyle w:val="Compact"/>
-              <w:jc w:val="left"/>
-            </w:pPr>
-            <w:r>
-              <w:t xml:space="preserve">Spatial (</w:t>
+              <w:t xml:space="preserve">Comparison (max over the four cases)</w:t>
+            </w:r>
+          </w:p>
+        </w:tc>
+        <w:tc>
+          <w:tcPr/>
+          <w:p>
+            <w:pPr>
+              <w:pStyle w:val="Compact"/>
+              <w:jc w:val="left"/>
+            </w:pPr>
+            <w:r>
+              <w:t xml:space="preserve">Price change at</w:t>
+            </w:r>
+            <w:r>
+              <w:t xml:space="preserve"> </w:t>
             </w:r>
             <m:oMath>
+              <m:sSub>
+                <m:e>
+                  <m:r>
+                    <m:t>S</m:t>
+                  </m:r>
+                </m:e>
+                <m:sub>
+                  <m:r>
+                    <m:t>0</m:t>
+                  </m:r>
+                </m:sub>
+              </m:sSub>
               <m:r>
-                <m:t>d</m:t>
-              </m:r>
-              <m:r>
-                <m:t>x</m:t>
+                <m:rPr>
+                  <m:sty m:val="p"/>
+                </m:rPr>
+                <m:t>∈</m:t>
               </m:r>
               <m:r>
                 <m:rPr>
                   <m:sty m:val="p"/>
                 </m:rPr>
-                <m:t>/</m:t>
+                <m:t>{</m:t>
               </m:r>
               <m:r>
-                <m:t>2</m:t>
-              </m:r>
-            </m:oMath>
-            <w:r>
-              <w:t xml:space="preserve">,</w:t>
-            </w:r>
-            <w:r>
-              <w:t xml:space="preserve"> </w:t>
-            </w:r>
-            <m:oMath>
-              <m:r>
-                <m:t>d</m:t>
-              </m:r>
-              <m:r>
-                <m:t>x</m:t>
+                <m:t>60</m:t>
               </m:r>
               <m:r>
                 <m:rPr>
                   <m:sty m:val="p"/>
                 </m:rPr>
-                <m:t>/</m:t>
+                <m:t>,</m:t>
               </m:r>
               <m:r>
-                <m:t>4</m:t>
-              </m:r>
-            </m:oMath>
-            <w:r>
-              <w:t xml:space="preserve">)</w:t>
-            </w:r>
-          </w:p>
-        </w:tc>
-        <w:tc>
-          <w:tcPr/>
-          <w:p>
-            <w:pPr>
-              <w:pStyle w:val="Compact"/>
-              <w:jc w:val="left"/>
-            </w:pPr>
-            <w:r>
-              <w:t xml:space="preserve">2e-5</w:t>
-            </w:r>
-          </w:p>
-        </w:tc>
-        <w:tc>
-          <w:tcPr/>
-          <w:p>
-            <w:pPr>
-              <w:pStyle w:val="Compact"/>
-              <w:jc w:val="left"/>
-            </w:pPr>
-            <w:r>
-              <w:t xml:space="preserve">1e-3</w:t>
-            </w:r>
-          </w:p>
-        </w:tc>
-      </w:tr>
-      <w:tr>
-        <w:tc>
-          <w:tcPr/>
-          <w:p>
-            <w:pPr>
-              <w:pStyle w:val="Compact"/>
-              <w:jc w:val="left"/>
-            </w:pPr>
-            <w:r>
-              <w:t xml:space="preserve">Time integration (</w:t>
-            </w:r>
-            <m:oMath>
-              <m:r>
-                <m:t>h</m:t>
+                <m:t>80</m:t>
               </m:r>
               <m:r>
                 <m:rPr>
                   <m:sty m:val="p"/>
                 </m:rPr>
-                <m:t>/</m:t>
+                <m:t>,</m:t>
               </m:r>
               <m:r>
-                <m:t>2</m:t>
-              </m:r>
-            </m:oMath>
-            <w:r>
-              <w:t xml:space="preserve">,</w:t>
-            </w:r>
-            <w:r>
-              <w:t xml:space="preserve"> </w:t>
-            </w:r>
-            <m:oMath>
-              <m:r>
-                <m:t>h</m:t>
+                <m:t>100</m:t>
               </m:r>
               <m:r>
                 <m:rPr>
                   <m:sty m:val="p"/>
                 </m:rPr>
-                <m:t>/</m:t>
+                <m:t>}</m:t>
+              </m:r>
+            </m:oMath>
+            <w:r>
+              <w:t xml:space="preserve"> </w:t>
+            </w:r>
+            <w:r>
+              <w:t xml:space="preserve">($)</w:t>
+            </w:r>
+          </w:p>
+        </w:tc>
+        <w:tc>
+          <w:tcPr/>
+          <w:p>
+            <w:pPr>
+              <w:pStyle w:val="Compact"/>
+              <w:jc w:val="left"/>
+            </w:pPr>
+            <w:r>
+              <w:t xml:space="preserve">Boundary change ($)</w:t>
+            </w:r>
+          </w:p>
+        </w:tc>
+      </w:tr>
+      <w:tr>
+        <w:tc>
+          <w:tcPr/>
+          <w:p>
+            <w:pPr>
+              <w:pStyle w:val="Compact"/>
+              <w:jc w:val="left"/>
+            </w:pPr>
+            <w:r>
+              <w:t xml:space="preserve">Spatial:</w:t>
+            </w:r>
+            <w:r>
+              <w:t xml:space="preserve"> </w:t>
+            </w:r>
+            <m:oMath>
+              <m:r>
+                <m:t>Δ</m:t>
               </m:r>
               <m:r>
-                <m:t>4</m:t>
+                <m:t>S</m:t>
               </m:r>
             </m:oMath>
             <w:r>
-              <w:t xml:space="preserve">)</w:t>
-            </w:r>
-          </w:p>
-        </w:tc>
-        <w:tc>
-          <w:tcPr/>
-          <w:p>
-            <w:pPr>
-              <w:pStyle w:val="Compact"/>
-              <w:jc w:val="left"/>
-            </w:pPr>
-            <w:r>
-              <w:t xml:space="preserve">7e-9</w:t>
-            </w:r>
-          </w:p>
-        </w:tc>
-        <w:tc>
-          <w:tcPr/>
-          <w:p>
-            <w:pPr>
-              <w:pStyle w:val="Compact"/>
-              <w:jc w:val="left"/>
-            </w:pPr>
-            <w:r>
-              <w:t xml:space="preserve">2e-6</w:t>
+              <w:t xml:space="preserve"> </w:t>
+            </w:r>
+            <w:r>
+              <w:t xml:space="preserve">0.10 → 0.05 (16 substeps)</w:t>
+            </w:r>
+          </w:p>
+        </w:tc>
+        <w:tc>
+          <w:tcPr/>
+          <w:p>
+            <w:pPr>
+              <w:pStyle w:val="Compact"/>
+              <w:jc w:val="left"/>
+            </w:pPr>
+            <w:r>
+              <w:t xml:space="preserve">2e-5</w:t>
+            </w:r>
+          </w:p>
+        </w:tc>
+        <w:tc>
+          <w:tcPr/>
+          <w:p>
+            <w:pPr>
+              <w:pStyle w:val="Compact"/>
+              <w:jc w:val="left"/>
+            </w:pPr>
+            <w:r>
+              <w:t xml:space="preserve">2e-3</w:t>
             </w:r>
           </w:p>
         </w:tc>
@@ -4775,87 +4525,128 @@
               <w:jc w:val="left"/>
             </w:pPr>
             <w:r>
-              <w:t xml:space="preserve">Domain / kernel tails</w:t>
-            </w:r>
-          </w:p>
-        </w:tc>
-        <w:tc>
-          <w:tcPr/>
-          <w:p>
-            <w:pPr>
-              <w:pStyle w:val="Compact"/>
-              <w:jc w:val="left"/>
-            </w:pPr>
+              <w:t xml:space="preserve">Time: 16 → 32 substeps (</w:t>
+            </w:r>
             <m:oMath>
               <m:r>
-                <m:rPr>
-                  <m:sty m:val="p"/>
-                </m:rPr>
-                <m:t>≤</m:t>
-              </m:r>
-              <m:sSup>
-                <m:e>
-                  <m:r>
-                    <m:t>10</m:t>
-                  </m:r>
-                </m:e>
-                <m:sup>
-                  <m:r>
-                    <m:rPr>
-                      <m:sty m:val="p"/>
-                    </m:rPr>
-                    <m:t>−</m:t>
-                  </m:r>
-                  <m:r>
-                    <m:t>14</m:t>
-                  </m:r>
-                </m:sup>
-              </m:sSup>
-            </m:oMath>
-          </w:p>
-        </w:tc>
-        <w:tc>
-          <w:tcPr/>
-          <w:p>
-            <w:pPr>
-              <w:pStyle w:val="Compact"/>
-              <w:jc w:val="left"/>
-            </w:pPr>
-            <m:oMath>
-              <m:r>
-                <m:rPr>
-                  <m:sty m:val="p"/>
-                </m:rPr>
-                <m:t>≤</m:t>
+                <m:t>Δ</m:t>
               </m:r>
               <m:r>
-                <m:t>3</m:t>
+                <m:t>S</m:t>
               </m:r>
               <m:r>
                 <m:rPr>
                   <m:sty m:val="p"/>
                 </m:rPr>
-                <m:t>×</m:t>
+                <m:t>=</m:t>
               </m:r>
-              <m:sSup>
-                <m:e>
-                  <m:r>
-                    <m:t>10</m:t>
-                  </m:r>
-                </m:e>
-                <m:sup>
-                  <m:r>
-                    <m:rPr>
-                      <m:sty m:val="p"/>
-                    </m:rPr>
-                    <m:t>−</m:t>
-                  </m:r>
-                  <m:r>
-                    <m:t>12</m:t>
-                  </m:r>
-                </m:sup>
-              </m:sSup>
+              <m:r>
+                <m:t>0.05</m:t>
+              </m:r>
             </m:oMath>
+            <w:r>
+              <w:t xml:space="preserve">)</w:t>
+            </w:r>
+          </w:p>
+        </w:tc>
+        <w:tc>
+          <w:tcPr/>
+          <w:p>
+            <w:pPr>
+              <w:pStyle w:val="Compact"/>
+              <w:jc w:val="left"/>
+            </w:pPr>
+            <w:r>
+              <w:t xml:space="preserve">2e-5</w:t>
+            </w:r>
+          </w:p>
+        </w:tc>
+        <w:tc>
+          <w:tcPr/>
+          <w:p>
+            <w:pPr>
+              <w:pStyle w:val="Compact"/>
+              <w:jc w:val="left"/>
+            </w:pPr>
+            <w:r>
+              <w:t xml:space="preserve">1e-3</w:t>
+            </w:r>
+          </w:p>
+        </w:tc>
+      </w:tr>
+      <w:tr>
+        <w:tc>
+          <w:tcPr/>
+          <w:p>
+            <w:pPr>
+              <w:pStyle w:val="Compact"/>
+              <w:jc w:val="left"/>
+            </w:pPr>
+            <w:r>
+              <w:t xml:space="preserve">Saved arrays vs recomputed</w:t>
+            </w:r>
+          </w:p>
+        </w:tc>
+        <w:tc>
+          <w:tcPr/>
+          <w:p>
+            <w:pPr>
+              <w:pStyle w:val="Compact"/>
+              <w:jc w:val="left"/>
+            </w:pPr>
+            <w:r>
+              <w:t xml:space="preserve">4e-12</w:t>
+            </w:r>
+          </w:p>
+        </w:tc>
+        <w:tc>
+          <w:tcPr/>
+          <w:p>
+            <w:pPr>
+              <w:pStyle w:val="Compact"/>
+              <w:jc w:val="left"/>
+            </w:pPr>
+            <w:r>
+              <w:t xml:space="preserve">2e-10</w:t>
+            </w:r>
+          </w:p>
+        </w:tc>
+      </w:tr>
+      <w:tr>
+        <w:tc>
+          <w:tcPr/>
+          <w:p>
+            <w:pPr>
+              <w:pStyle w:val="Compact"/>
+              <w:jc w:val="left"/>
+            </w:pPr>
+            <w:r>
+              <w:t xml:space="preserve">Our independent log-grid solver vs saved arrays</w:t>
+            </w:r>
+          </w:p>
+        </w:tc>
+        <w:tc>
+          <w:tcPr/>
+          <w:p>
+            <w:pPr>
+              <w:pStyle w:val="Compact"/>
+              <w:jc w:val="left"/>
+            </w:pPr>
+            <w:r>
+              <w:t xml:space="preserve">8e-6</w:t>
+            </w:r>
+          </w:p>
+        </w:tc>
+        <w:tc>
+          <w:tcPr/>
+          <w:p>
+            <w:pPr>
+              <w:pStyle w:val="Compact"/>
+              <w:jc w:val="left"/>
+            </w:pPr>
+            <w:r>
+              <w:t xml:space="preserve">1e-3</w:t>
+            </w:r>
           </w:p>
         </w:tc>
       </w:tr>
@@ -4873,7 +4664,7 @@
               </m:r>
             </m:oMath>
             <w:r>
-              <w:t xml:space="preserve">: 180 → 360 (different problem)</w:t>
+              <w:t xml:space="preserve">: 180 → 360 (a different problem)</w:t>
             </w:r>
           </w:p>
         </w:tc>
@@ -4897,7 +4688,7 @@
               <w:jc w:val="left"/>
             </w:pPr>
             <w:r>
-              <w:t xml:space="preserve">0.305</w:t>
+              <w:t xml:space="preserve">0.306</w:t>
             </w:r>
           </w:p>
         </w:tc>
@@ -4908,6 +4699,69 @@
         <w:pStyle w:val="BodyText"/>
       </w:pPr>
       <w:r>
+        <w:t xml:space="preserve">The largest boundary changes occur on the last exercise date, where the boundary is steepest. As an independent check, our own solver agrees with the supplied arrays to within the reference’s own refinement changes. Our solver uses a different method: an exact Gaussian step on a</w:t>
+      </w:r>
+      <w:r>
+        <w:t xml:space="preserve"> </w:t>
+      </w:r>
+      <m:oMath>
+        <m:r>
+          <m:rPr>
+            <m:sty m:val="p"/>
+          </m:rPr>
+          <m:t>log</m:t>
+        </m:r>
+        <m:r>
+          <m:t>S</m:t>
+        </m:r>
+      </m:oMath>
+      <w:r>
+        <w:t xml:space="preserve"> </w:t>
+      </w:r>
+      <w:r>
+        <w:t xml:space="preserve">grid, with a</w:t>
+      </w:r>
+      <w:r>
+        <w:t xml:space="preserve"> </w:t>
+      </w:r>
+      <m:oMath>
+        <m:r>
+          <m:t>d</m:t>
+        </m:r>
+        <m:sSup>
+          <m:e>
+            <m:r>
+              <m:t>x</m:t>
+            </m:r>
+          </m:e>
+          <m:sup>
+            <m:r>
+              <m:t>2</m:t>
+            </m:r>
+          </m:sup>
+        </m:sSup>
+        <m:r>
+          <m:rPr>
+            <m:sty m:val="p"/>
+          </m:rPr>
+          <m:t>/</m:t>
+        </m:r>
+        <m:r>
+          <m:t>6</m:t>
+        </m:r>
+      </m:oMath>
+      <w:r>
+        <w:t xml:space="preserve"> </w:t>
+      </w:r>
+      <w:r>
+        <w:t xml:space="preserve">variance correction.</w:t>
+      </w:r>
+    </w:p>
+    <w:p>
+      <w:pPr>
+        <w:pStyle w:val="BodyText"/>
+      </w:pPr>
+      <w:r>
         <w:t xml:space="preserve">Refinement approximates the</w:t>
       </w:r>
       <w:r>
@@ -4951,12 +4805,21 @@
         <w:t xml:space="preserve">problem</w:t>
       </w:r>
       <w:r>
-        <w:t xml:space="preserve">: more exercise rights raise the value and move the boundary about 100 times more than any refinement. So an accuracy gain smaller than about</w:t>
-      </w:r>
-      <w:r>
-        <w:t xml:space="preserve"> </w:t>
-      </w:r>
-      <m:oMath>
+        <w:t xml:space="preserve">: more exercise rights raise the value, and the boundary moves over 100 times more than under any refinement. The reference is precise to about</w:t>
+      </w:r>
+      <w:r>
+        <w:t xml:space="preserve"> </w:t>
+      </w:r>
+      <m:oMath>
+        <m:r>
+          <m:t>2</m:t>
+        </m:r>
+        <m:r>
+          <m:rPr>
+            <m:sty m:val="p"/>
+          </m:rPr>
+          <m:t>×</m:t>
+        </m:r>
         <m:sSup>
           <m:e>
             <m:r>
@@ -4980,12 +4843,21 @@
         <w:t xml:space="preserve"> </w:t>
       </w:r>
       <w:r>
-        <w:t xml:space="preserve">$ in price or</w:t>
-      </w:r>
-      <w:r>
-        <w:t xml:space="preserve"> </w:t>
-      </w:r>
-      <m:oMath>
+        <w:t xml:space="preserve">$ in price and</w:t>
+      </w:r>
+      <w:r>
+        <w:t xml:space="preserve"> </w:t>
+      </w:r>
+      <m:oMath>
+        <m:r>
+          <m:t>2</m:t>
+        </m:r>
+        <m:r>
+          <m:rPr>
+            <m:sty m:val="p"/>
+          </m:rPr>
+          <m:t>×</m:t>
+        </m:r>
         <m:sSup>
           <m:e>
             <m:r>
@@ -5009,7 +4881,7 @@
         <w:t xml:space="preserve"> </w:t>
       </w:r>
       <w:r>
-        <w:t xml:space="preserve">$ in boundary cannot be resolved against this reference.</w:t>
+        <w:t xml:space="preserve">$ in boundary, so smaller claimed accuracy gains cannot be resolved.</w:t>
       </w:r>
     </w:p>
     <w:p>
@@ -5027,12 +4899,18 @@
         <w:t xml:space="preserve"> </w:t>
       </w:r>
       <w:r>
-        <w:t xml:space="preserve">We sample the exact lognormal step and apply</w:t>
-      </w:r>
-      <w:r>
-        <w:t xml:space="preserve"> </w:t>
-      </w:r>
-      <m:oMath>
+        <w:t xml:space="preserve">We sample the exact lognormal step, adding</w:t>
+      </w:r>
+      <w:r>
+        <w:t xml:space="preserve"> </w:t>
+      </w:r>
+      <m:oMath>
+        <m:r>
+          <m:rPr>
+            <m:sty m:val="p"/>
+          </m:rPr>
+          <m:t>log</m:t>
+        </m:r>
         <m:d>
           <m:dPr>
             <m:begChr m:val="("/>
@@ -5060,7 +4938,7 @@
         <w:t xml:space="preserve"> </w:t>
       </w:r>
       <w:r>
-        <w:t xml:space="preserve">on arrival at an integer dividend index. A path that starts at a dividend date is already post-jump. On the final</w:t>
+        <w:t xml:space="preserve">in the column that arrives at each integer dividend index (the README arithmetic). A path that starts at a dividend date is already post-jump. On the final</w:t>
       </w:r>
       <w:r>
         <w:t xml:space="preserve"> </w:t>
@@ -5223,37 +5101,6 @@
         <w:t xml:space="preserve">0.12, 0.62, 1.96, 0.23 for cases 0–3.</w:t>
       </w:r>
     </w:p>
-    <w:p>
-      <w:pPr>
-        <w:pStyle w:val="BodyText"/>
-      </w:pPr>
-      <w:r>
-        <w:t xml:space="preserve">The optimal boundary lies on the cap</w:t>
-      </w:r>
-      <w:r>
-        <w:t xml:space="preserve"> </w:t>
-      </w:r>
-      <m:oMath>
-        <m:sSub>
-          <m:e>
-            <m:r>
-              <m:t>U</m:t>
-            </m:r>
-          </m:e>
-          <m:sub>
-            <m:r>
-              <m:t>j</m:t>
-            </m:r>
-          </m:sub>
-        </m:sSub>
-      </m:oMath>
-      <w:r>
-        <w:t xml:space="preserve"> </w:t>
-      </w:r>
-      <w:r>
-        <w:t xml:space="preserve">close to each dividend, which is why both fitted policies are given the cap rather than learning it.</w:t>
-      </w:r>
-    </w:p>
     <w:bookmarkEnd w:id="21"/>
     <w:bookmarkStart w:id="22" w:name="least-squares-policy"/>
     <w:p>
@@ -5828,7 +5675,7 @@
               <w:jc w:val="left"/>
             </w:pPr>
             <w:r>
-              <w:t xml:space="preserve">179</w:t>
+              <w:t xml:space="preserve">176</w:t>
             </w:r>
           </w:p>
         </w:tc>
@@ -5914,19 +5761,19 @@
               <w:jc w:val="left"/>
             </w:pPr>
             <w:r>
-              <w:t xml:space="preserve">142</w:t>
-            </w:r>
-          </w:p>
-        </w:tc>
-        <w:tc>
-          <w:tcPr/>
-          <w:p>
-            <w:pPr>
-              <w:pStyle w:val="Compact"/>
-              <w:jc w:val="left"/>
-            </w:pPr>
-            <w:r>
-              <w:t xml:space="preserve">85</w:t>
+              <w:t xml:space="preserve">138</w:t>
+            </w:r>
+          </w:p>
+        </w:tc>
+        <w:tc>
+          <w:tcPr/>
+          <w:p>
+            <w:pPr>
+              <w:pStyle w:val="Compact"/>
+              <w:jc w:val="left"/>
+            </w:pPr>
+            <w:r>
+              <w:t xml:space="preserve">83</w:t>
             </w:r>
           </w:p>
         </w:tc>
@@ -6086,19 +5933,19 @@
               <w:jc w:val="left"/>
             </w:pPr>
             <w:r>
-              <w:t xml:space="preserve">264</w:t>
-            </w:r>
-          </w:p>
-        </w:tc>
-        <w:tc>
-          <w:tcPr/>
-          <w:p>
-            <w:pPr>
-              <w:pStyle w:val="Compact"/>
-              <w:jc w:val="left"/>
-            </w:pPr>
-            <w:r>
-              <w:t xml:space="preserve">149</w:t>
+              <w:t xml:space="preserve">273</w:t>
+            </w:r>
+          </w:p>
+        </w:tc>
+        <w:tc>
+          <w:tcPr/>
+          <w:p>
+            <w:pPr>
+              <w:pStyle w:val="Compact"/>
+              <w:jc w:val="left"/>
+            </w:pPr>
+            <w:r>
+              <w:t xml:space="preserve">154</w:t>
             </w:r>
           </w:p>
         </w:tc>
@@ -6261,7 +6108,7 @@
       <w:pPr>
         <w:numPr>
           <w:ilvl w:val="0"/>
-          <w:numId w:val="1003"/>
+          <w:numId w:val="1002"/>
         </w:numPr>
         <w:pStyle w:val="Compact"/>
       </w:pPr>
@@ -6296,15 +6143,7 @@
       </w:r>
       <m:oMath>
         <m:r>
-          <m:t>0.03</m:t>
-        </m:r>
-      </m:oMath>
-      <w:r>
-        <w:t xml:space="preserve">–</w:t>
-      </w:r>
-      <m:oMath>
-        <m:r>
-          <m:t>0.05</m:t>
+          <m:t>0.065</m:t>
         </m:r>
         <m:r>
           <m:t>K</m:t>
@@ -6314,14 +6153,14 @@
         <w:t xml:space="preserve"> </w:t>
       </w:r>
       <w:r>
-        <w:t xml:space="preserve">low and is noisy near maturity, where the value function has a kink.</w:t>
+        <w:t xml:space="preserve">low on average and is noisy near maturity, where the value function has a kink.</w:t>
       </w:r>
     </w:p>
     <w:p>
       <w:pPr>
         <w:numPr>
           <w:ilvl w:val="0"/>
-          <w:numId w:val="1003"/>
+          <w:numId w:val="1002"/>
         </w:numPr>
         <w:pStyle w:val="Compact"/>
       </w:pPr>
@@ -6399,12 +6238,12 @@
       <w:pPr>
         <w:numPr>
           <w:ilvl w:val="0"/>
-          <w:numId w:val="1003"/>
+          <w:numId w:val="1002"/>
         </w:numPr>
         <w:pStyle w:val="Compact"/>
       </w:pPr>
       <w:r>
-        <w:t xml:space="preserve">Close to each dividend the cap takes over. It binds on 85 dates (</w:t>
+        <w:t xml:space="preserve">Close to each dividend the cap takes over. It binds on 83 dates (</w:t>
       </w:r>
       <m:oMath>
         <m:r>
@@ -6421,7 +6260,7 @@
         </m:r>
       </m:oMath>
       <w:r>
-        <w:t xml:space="preserve">) and 149 dates (</w:t>
+        <w:t xml:space="preserve">) and 154 dates (</w:t>
       </w:r>
       <m:oMath>
         <m:r>
@@ -6473,7 +6312,7 @@
       <w:pPr>
         <w:numPr>
           <w:ilvl w:val="0"/>
-          <w:numId w:val="1004"/>
+          <w:numId w:val="1003"/>
         </w:numPr>
         <w:pStyle w:val="Compact"/>
       </w:pPr>
@@ -6621,7 +6460,7 @@
       <w:pPr>
         <w:numPr>
           <w:ilvl w:val="0"/>
-          <w:numId w:val="1004"/>
+          <w:numId w:val="1003"/>
         </w:numPr>
         <w:pStyle w:val="Compact"/>
       </w:pPr>
@@ -6673,7 +6512,7 @@
       <w:pPr>
         <w:numPr>
           <w:ilvl w:val="0"/>
-          <w:numId w:val="1004"/>
+          <w:numId w:val="1003"/>
         </w:numPr>
         <w:pStyle w:val="Compact"/>
       </w:pPr>
@@ -6695,7 +6534,7 @@
       <w:pPr>
         <w:numPr>
           <w:ilvl w:val="0"/>
-          <w:numId w:val="1004"/>
+          <w:numId w:val="1003"/>
         </w:numPr>
         <w:pStyle w:val="Compact"/>
       </w:pPr>
@@ -6717,7 +6556,7 @@
       <w:pPr>
         <w:numPr>
           <w:ilvl w:val="0"/>
-          <w:numId w:val="1004"/>
+          <w:numId w:val="1003"/>
         </w:numPr>
         <w:pStyle w:val="Compact"/>
       </w:pPr>
@@ -6732,7 +6571,7 @@
         <w:t xml:space="preserve"> </w:t>
       </w:r>
       <w:r>
-        <w:t xml:space="preserve">19 s supervised plus 64 s payoff training for all four cases on 2 CPU threads.</w:t>
+        <w:t xml:space="preserve">5 s supervised plus 41 s payoff training for all four cases, with 2 CPU threads, 1 inter-op thread and deterministic algorithms (README settings).</w:t>
       </w:r>
     </w:p>
     <w:p>
@@ -7279,55 +7118,55 @@
               <w:jc w:val="left"/>
             </w:pPr>
             <w:r>
-              <w:t xml:space="preserve">58.5085</w:t>
-            </w:r>
-          </w:p>
-        </w:tc>
-        <w:tc>
-          <w:tcPr/>
-          <w:p>
-            <w:pPr>
-              <w:pStyle w:val="Compact"/>
-              <w:jc w:val="left"/>
-            </w:pPr>
-            <w:r>
-              <w:t xml:space="preserve">2400</w:t>
-            </w:r>
-          </w:p>
-        </w:tc>
-        <w:tc>
-          <w:tcPr/>
-          <w:p>
-            <w:pPr>
-              <w:pStyle w:val="Compact"/>
-              <w:jc w:val="left"/>
-            </w:pPr>
-            <w:r>
-              <w:t xml:space="preserve">58.5307</w:t>
-            </w:r>
-          </w:p>
-        </w:tc>
-        <w:tc>
-          <w:tcPr/>
-          <w:p>
-            <w:pPr>
-              <w:pStyle w:val="Compact"/>
-              <w:jc w:val="left"/>
-            </w:pPr>
-            <w:r>
-              <w:t xml:space="preserve">0.022 (0.041)</w:t>
-            </w:r>
-          </w:p>
-        </w:tc>
-        <w:tc>
-          <w:tcPr/>
-          <w:p>
-            <w:pPr>
-              <w:pStyle w:val="Compact"/>
-              <w:jc w:val="left"/>
-            </w:pPr>
-            <w:r>
-              <w:t xml:space="preserve">0.065 → 0.078</w:t>
+              <w:t xml:space="preserve">59.1551</w:t>
+            </w:r>
+          </w:p>
+        </w:tc>
+        <w:tc>
+          <w:tcPr/>
+          <w:p>
+            <w:pPr>
+              <w:pStyle w:val="Compact"/>
+              <w:jc w:val="left"/>
+            </w:pPr>
+            <w:r>
+              <w:t xml:space="preserve">2000</w:t>
+            </w:r>
+          </w:p>
+        </w:tc>
+        <w:tc>
+          <w:tcPr/>
+          <w:p>
+            <w:pPr>
+              <w:pStyle w:val="Compact"/>
+              <w:jc w:val="left"/>
+            </w:pPr>
+            <w:r>
+              <w:t xml:space="preserve">59.1626</w:t>
+            </w:r>
+          </w:p>
+        </w:tc>
+        <w:tc>
+          <w:tcPr/>
+          <w:p>
+            <w:pPr>
+              <w:pStyle w:val="Compact"/>
+              <w:jc w:val="left"/>
+            </w:pPr>
+            <w:r>
+              <w:t xml:space="preserve">0.008 (0.006)</w:t>
+            </w:r>
+          </w:p>
+        </w:tc>
+        <w:tc>
+          <w:tcPr/>
+          <w:p>
+            <w:pPr>
+              <w:pStyle w:val="Compact"/>
+              <w:jc w:val="left"/>
+            </w:pPr>
+            <w:r>
+              <w:t xml:space="preserve">0.069 → 0.072</w:t>
             </w:r>
           </w:p>
         </w:tc>
@@ -7353,55 +7192,55 @@
               <w:jc w:val="left"/>
             </w:pPr>
             <w:r>
-              <w:t xml:space="preserve">58.4086</w:t>
-            </w:r>
-          </w:p>
-        </w:tc>
-        <w:tc>
-          <w:tcPr/>
-          <w:p>
-            <w:pPr>
-              <w:pStyle w:val="Compact"/>
-              <w:jc w:val="left"/>
-            </w:pPr>
-            <w:r>
-              <w:t xml:space="preserve">0</w:t>
-            </w:r>
-          </w:p>
-        </w:tc>
-        <w:tc>
-          <w:tcPr/>
-          <w:p>
-            <w:pPr>
-              <w:pStyle w:val="Compact"/>
-              <w:jc w:val="left"/>
-            </w:pPr>
-            <w:r>
-              <w:t xml:space="preserve">58.4086</w:t>
-            </w:r>
-          </w:p>
-        </w:tc>
-        <w:tc>
-          <w:tcPr/>
-          <w:p>
-            <w:pPr>
-              <w:pStyle w:val="Compact"/>
-              <w:jc w:val="left"/>
-            </w:pPr>
-            <w:r>
-              <w:t xml:space="preserve">0.000 (0.000)</w:t>
-            </w:r>
-          </w:p>
-        </w:tc>
-        <w:tc>
-          <w:tcPr/>
-          <w:p>
-            <w:pPr>
-              <w:pStyle w:val="Compact"/>
-              <w:jc w:val="left"/>
-            </w:pPr>
-            <w:r>
-              <w:t xml:space="preserve">0.019 → 0.019</w:t>
+              <w:t xml:space="preserve">58.9883</w:t>
+            </w:r>
+          </w:p>
+        </w:tc>
+        <w:tc>
+          <w:tcPr/>
+          <w:p>
+            <w:pPr>
+              <w:pStyle w:val="Compact"/>
+              <w:jc w:val="left"/>
+            </w:pPr>
+            <w:r>
+              <w:t xml:space="preserve">2000</w:t>
+            </w:r>
+          </w:p>
+        </w:tc>
+        <w:tc>
+          <w:tcPr/>
+          <w:p>
+            <w:pPr>
+              <w:pStyle w:val="Compact"/>
+              <w:jc w:val="left"/>
+            </w:pPr>
+            <w:r>
+              <w:t xml:space="preserve">59.0156</w:t>
+            </w:r>
+          </w:p>
+        </w:tc>
+        <w:tc>
+          <w:tcPr/>
+          <w:p>
+            <w:pPr>
+              <w:pStyle w:val="Compact"/>
+              <w:jc w:val="left"/>
+            </w:pPr>
+            <w:r>
+              <w:t xml:space="preserve">0.027 (0.028)</w:t>
+            </w:r>
+          </w:p>
+        </w:tc>
+        <w:tc>
+          <w:tcPr/>
+          <w:p>
+            <w:pPr>
+              <w:pStyle w:val="Compact"/>
+              <w:jc w:val="left"/>
+            </w:pPr>
+            <w:r>
+              <w:t xml:space="preserve">0.019 → 0.017</w:t>
             </w:r>
           </w:p>
         </w:tc>
@@ -7427,55 +7266,55 @@
               <w:jc w:val="left"/>
             </w:pPr>
             <w:r>
-              <w:t xml:space="preserve">59.3109</w:t>
-            </w:r>
-          </w:p>
-        </w:tc>
-        <w:tc>
-          <w:tcPr/>
-          <w:p>
-            <w:pPr>
-              <w:pStyle w:val="Compact"/>
-              <w:jc w:val="left"/>
-            </w:pPr>
-            <w:r>
-              <w:t xml:space="preserve">2400</w:t>
-            </w:r>
-          </w:p>
-        </w:tc>
-        <w:tc>
-          <w:tcPr/>
-          <w:p>
-            <w:pPr>
-              <w:pStyle w:val="Compact"/>
-              <w:jc w:val="left"/>
-            </w:pPr>
-            <w:r>
-              <w:t xml:space="preserve">59.3656</w:t>
-            </w:r>
-          </w:p>
-        </w:tc>
-        <w:tc>
-          <w:tcPr/>
-          <w:p>
-            <w:pPr>
-              <w:pStyle w:val="Compact"/>
-              <w:jc w:val="left"/>
-            </w:pPr>
-            <w:r>
-              <w:t xml:space="preserve">0.055 (0.038)</w:t>
-            </w:r>
-          </w:p>
-        </w:tc>
-        <w:tc>
-          <w:tcPr/>
-          <w:p>
-            <w:pPr>
-              <w:pStyle w:val="Compact"/>
-              <w:jc w:val="left"/>
-            </w:pPr>
-            <w:r>
-              <w:t xml:space="preserve">0.056 → 0.023</w:t>
+              <w:t xml:space="preserve">59.3921</w:t>
+            </w:r>
+          </w:p>
+        </w:tc>
+        <w:tc>
+          <w:tcPr/>
+          <w:p>
+            <w:pPr>
+              <w:pStyle w:val="Compact"/>
+              <w:jc w:val="left"/>
+            </w:pPr>
+            <w:r>
+              <w:t xml:space="preserve">1200</w:t>
+            </w:r>
+          </w:p>
+        </w:tc>
+        <w:tc>
+          <w:tcPr/>
+          <w:p>
+            <w:pPr>
+              <w:pStyle w:val="Compact"/>
+              <w:jc w:val="left"/>
+            </w:pPr>
+            <w:r>
+              <w:t xml:space="preserve">59.3945</w:t>
+            </w:r>
+          </w:p>
+        </w:tc>
+        <w:tc>
+          <w:tcPr/>
+          <w:p>
+            <w:pPr>
+              <w:pStyle w:val="Compact"/>
+              <w:jc w:val="left"/>
+            </w:pPr>
+            <w:r>
+              <w:t xml:space="preserve">0.002 (0.009)</w:t>
+            </w:r>
+          </w:p>
+        </w:tc>
+        <w:tc>
+          <w:tcPr/>
+          <w:p>
+            <w:pPr>
+              <w:pStyle w:val="Compact"/>
+              <w:jc w:val="left"/>
+            </w:pPr>
+            <w:r>
+              <w:t xml:space="preserve">0.064 → 0.062</w:t>
             </w:r>
           </w:p>
         </w:tc>
@@ -7501,55 +7340,55 @@
               <w:jc w:val="left"/>
             </w:pPr>
             <w:r>
-              <w:t xml:space="preserve">60.5485</w:t>
-            </w:r>
-          </w:p>
-        </w:tc>
-        <w:tc>
-          <w:tcPr/>
-          <w:p>
-            <w:pPr>
-              <w:pStyle w:val="Compact"/>
-              <w:jc w:val="left"/>
-            </w:pPr>
-            <w:r>
-              <w:t xml:space="preserve">0</w:t>
-            </w:r>
-          </w:p>
-        </w:tc>
-        <w:tc>
-          <w:tcPr/>
-          <w:p>
-            <w:pPr>
-              <w:pStyle w:val="Compact"/>
-              <w:jc w:val="left"/>
-            </w:pPr>
-            <w:r>
-              <w:t xml:space="preserve">60.5485</w:t>
-            </w:r>
-          </w:p>
-        </w:tc>
-        <w:tc>
-          <w:tcPr/>
-          <w:p>
-            <w:pPr>
-              <w:pStyle w:val="Compact"/>
-              <w:jc w:val="left"/>
-            </w:pPr>
-            <w:r>
-              <w:t xml:space="preserve">0.000 (0.000)</w:t>
-            </w:r>
-          </w:p>
-        </w:tc>
-        <w:tc>
-          <w:tcPr/>
-          <w:p>
-            <w:pPr>
-              <w:pStyle w:val="Compact"/>
-              <w:jc w:val="left"/>
-            </w:pPr>
-            <w:r>
-              <w:t xml:space="preserve">0.043 → 0.043</w:t>
+              <w:t xml:space="preserve">60.5318</w:t>
+            </w:r>
+          </w:p>
+        </w:tc>
+        <w:tc>
+          <w:tcPr/>
+          <w:p>
+            <w:pPr>
+              <w:pStyle w:val="Compact"/>
+              <w:jc w:val="left"/>
+            </w:pPr>
+            <w:r>
+              <w:t xml:space="preserve">2400</w:t>
+            </w:r>
+          </w:p>
+        </w:tc>
+        <w:tc>
+          <w:tcPr/>
+          <w:p>
+            <w:pPr>
+              <w:pStyle w:val="Compact"/>
+              <w:jc w:val="left"/>
+            </w:pPr>
+            <w:r>
+              <w:t xml:space="preserve">60.5550</w:t>
+            </w:r>
+          </w:p>
+        </w:tc>
+        <w:tc>
+          <w:tcPr/>
+          <w:p>
+            <w:pPr>
+              <w:pStyle w:val="Compact"/>
+              <w:jc w:val="left"/>
+            </w:pPr>
+            <w:r>
+              <w:t xml:space="preserve">0.023 (0.035)</w:t>
+            </w:r>
+          </w:p>
+        </w:tc>
+        <w:tc>
+          <w:tcPr/>
+          <w:p>
+            <w:pPr>
+              <w:pStyle w:val="Compact"/>
+              <w:jc w:val="left"/>
+            </w:pPr>
+            <w:r>
+              <w:t xml:space="preserve">0.029 → 0.043</w:t>
             </w:r>
           </w:p>
         </w:tc>
@@ -7570,356 +7409,252 @@
         <w:t xml:space="preserve"> </w:t>
       </w:r>
       <w:r>
-        <w:t xml:space="preserve">Every paired validation gain is within about 2 SE of zero, so on 4,096 random-start paths the checkpoints are statistically indistinguishable.</w:t>
+        <w:t xml:space="preserve">The selected checkpoints are 2000, 2000, 1200, 2400 for cases 0–3; checkpoint 0 was never selected. Every selected gain over checkpoint 0 is within 1.3 paired SE, so on 4,096 random-start paths the checkpoints are statistically indistinguishable, and selection is close to picking among equals.</w:t>
+      </w:r>
+    </w:p>
+    <w:p>
+      <w:pPr>
+        <w:pStyle w:val="BodyText"/>
+      </w:pPr>
+      <w:r>
+        <w:t xml:space="preserve">Payoff training changed the boundary error little in cases 0–2. In case 3 it made the boundary</w:t>
+      </w:r>
+      <w:r>
+        <w:t xml:space="preserve"> </w:t>
+      </w:r>
+      <w:r>
+        <w:rPr>
+          <w:iCs/>
+          <w:i/>
+        </w:rPr>
+        <w:t xml:space="preserve">worse</w:t>
+      </w:r>
+      <w:r>
+        <w:t xml:space="preserve"> </w:t>
+      </w:r>
+      <w:r>
+        <w:t xml:space="preserve">(</w:t>
+      </w:r>
+      <m:oMath>
+        <m:sSub>
+          <m:e>
+            <m:r>
+              <m:t>E</m:t>
+            </m:r>
+          </m:e>
+          <m:sub>
+            <m:r>
+              <m:t>m</m:t>
+            </m:r>
+            <m:r>
+              <m:t>e</m:t>
+            </m:r>
+            <m:r>
+              <m:t>a</m:t>
+            </m:r>
+            <m:r>
+              <m:t>n</m:t>
+            </m:r>
+          </m:sub>
+        </m:sSub>
+      </m:oMath>
+      <w:r>
+        <w:t xml:space="preserve"> </w:t>
+      </w:r>
+      <w:r>
+        <w:t xml:space="preserve">0.029 → 0.043): it overshoots the reference after</w:t>
+      </w:r>
+      <w:r>
+        <w:t xml:space="preserve"> </w:t>
+      </w:r>
+      <m:oMath>
+        <m:sSub>
+          <m:e>
+            <m:r>
+              <m:t>d</m:t>
+            </m:r>
+          </m:e>
+          <m:sub>
+            <m:r>
+              <m:t>1</m:t>
+            </m:r>
+          </m:sub>
+        </m:sSub>
+      </m:oMath>
+      <w:r>
+        <w:t xml:space="preserve"> </w:t>
+      </w:r>
+      <w:r>
+        <w:t xml:space="preserve">and sits below it between</w:t>
+      </w:r>
+      <w:r>
+        <w:t xml:space="preserve"> </w:t>
+      </w:r>
+      <m:oMath>
+        <m:sSub>
+          <m:e>
+            <m:r>
+              <m:t>d</m:t>
+            </m:r>
+          </m:e>
+          <m:sub>
+            <m:r>
+              <m:t>2</m:t>
+            </m:r>
+          </m:sub>
+        </m:sSub>
+      </m:oMath>
+      <w:r>
+        <w:t xml:space="preserve"> </w:t>
+      </w:r>
+      <w:r>
+        <w:t xml:space="preserve">and</w:t>
+      </w:r>
+      <w:r>
+        <w:t xml:space="preserve"> </w:t>
+      </w:r>
+      <m:oMath>
+        <m:sSub>
+          <m:e>
+            <m:r>
+              <m:t>d</m:t>
+            </m:r>
+          </m:e>
+          <m:sub>
+            <m:r>
+              <m:t>3</m:t>
+            </m:r>
+          </m:sub>
+        </m:sSub>
+      </m:oMath>
+      <w:r>
+        <w:t xml:space="preserve">. The validation mean barely reacts, because the value is flat near the optimal threshold (Section 5).</w:t>
+      </w:r>
+    </w:p>
+    <w:p>
+      <w:pPr>
+        <w:pStyle w:val="BodyText"/>
+      </w:pPr>
+      <w:r>
+        <w:rPr>
+          <w:bCs/>
+          <w:b/>
+        </w:rPr>
+        <w:t xml:space="preserve">Research connection.</w:t>
       </w:r>
     </w:p>
     <w:p>
       <w:pPr>
         <w:numPr>
           <w:ilvl w:val="0"/>
-          <w:numId w:val="1005"/>
+          <w:numId w:val="1004"/>
         </w:numPr>
         <w:pStyle w:val="Compact"/>
       </w:pPr>
+      <w:r>
+        <w:rPr>
+          <w:iCs/>
+          <w:i/>
+        </w:rPr>
+        <w:t xml:space="preserve">Becker, Cheridito and Jentzen (2019)</w:t>
+      </w:r>
+      <w:r>
+        <w:t xml:space="preserve"> </w:t>
+      </w:r>
+      <w:r>
+        <w:t xml:space="preserve">learn one stop/continue network per date, relaxed to a logistic probability and trained</w:t>
+      </w:r>
+      <w:r>
+        <w:t xml:space="preserve"> </w:t>
+      </w:r>
       <w:r>
         <w:rPr>
           <w:bCs/>
           <w:b/>
         </w:rPr>
-        <w:t xml:space="preserve">Cases 1 and 3:</w:t>
-      </w:r>
-      <w:r>
-        <w:t xml:space="preserve"> </w:t>
-      </w:r>
-      <w:r>
-        <w:t xml:space="preserve">checkpoint 0 is selected, i.e. the smoothed LS warm start.</w:t>
+        <w:t xml:space="preserve">backward, one date at a time</w:t>
+      </w:r>
+      <w:r>
+        <w:t xml:space="preserve">. Economic objective: the</w:t>
+      </w:r>
+      <w:r>
+        <w:t xml:space="preserve"> </w:t>
+      </w:r>
+      <w:r>
+        <w:rPr>
+          <w:bCs/>
+          <w:b/>
+        </w:rPr>
+        <w:t xml:space="preserve">optimal-stopping value</w:t>
+      </w:r>
+      <w:r>
+        <w:t xml:space="preserve">, i.e. maximising the expected reward. The learned rule gives a lower bound; a dual martingale gives an upper bound.</w:t>
       </w:r>
     </w:p>
     <w:p>
       <w:pPr>
         <w:numPr>
           <w:ilvl w:val="0"/>
-          <w:numId w:val="1005"/>
+          <w:numId w:val="1004"/>
         </w:numPr>
         <w:pStyle w:val="Compact"/>
       </w:pPr>
+      <w:r>
+        <w:rPr>
+          <w:iCs/>
+          <w:i/>
+        </w:rPr>
+        <w:t xml:space="preserve">Bühler et al. (2019)</w:t>
+      </w:r>
+      <w:r>
+        <w:t xml:space="preserve"> </w:t>
+      </w:r>
+      <w:r>
+        <w:t xml:space="preserve">train semi-recurrent</w:t>
+      </w:r>
+      <w:r>
+        <w:t xml:space="preserve"> </w:t>
+      </w:r>
       <w:r>
         <w:rPr>
           <w:bCs/>
           <w:b/>
         </w:rPr>
-        <w:t xml:space="preserve">Case 2:</w:t>
-      </w:r>
-      <w:r>
-        <w:t xml:space="preserve"> </w:t>
-      </w:r>
-      <w:r>
-        <w:t xml:space="preserve">payoff training more than halved the boundary error.</w:t>
+        <w:t xml:space="preserve">hedging-strategy</w:t>
+      </w:r>
+      <w:r>
+        <w:t xml:space="preserve"> </w:t>
+      </w:r>
+      <w:r>
+        <w:t xml:space="preserve">networks with Adam on simulated paths. Economic objective:</w:t>
+      </w:r>
+      <w:r>
+        <w:t xml:space="preserve"> </w:t>
+      </w:r>
+      <w:r>
+        <w:rPr>
+          <w:bCs/>
+          <w:b/>
+        </w:rPr>
+        <w:t xml:space="preserve">minimise a convex risk measure</w:t>
+      </w:r>
+      <w:r>
+        <w:t xml:space="preserve"> </w:t>
+      </w:r>
+      <w:r>
+        <w:t xml:space="preserve">(e.g. expected shortfall) of hedged P&amp;L under transaction costs, which yields indifference prices.</w:t>
       </w:r>
     </w:p>
     <w:p>
       <w:pPr>
         <w:numPr>
           <w:ilvl w:val="0"/>
-          <w:numId w:val="1005"/>
+          <w:numId w:val="1004"/>
         </w:numPr>
         <w:pStyle w:val="Compact"/>
       </w:pPr>
       <w:r>
-        <w:rPr>
-          <w:bCs/>
-          <w:b/>
-        </w:rPr>
-        <w:t xml:space="preserve">Case 0:</w:t>
-      </w:r>
-      <w:r>
-        <w:t xml:space="preserve"> </w:t>
-      </w:r>
-      <w:r>
-        <w:t xml:space="preserve">the selected checkpoint has a</w:t>
-      </w:r>
-      <w:r>
-        <w:t xml:space="preserve"> </w:t>
-      </w:r>
-      <w:r>
-        <w:rPr>
-          <w:iCs/>
-          <w:i/>
-        </w:rPr>
-        <w:t xml:space="preserve">worse</w:t>
-      </w:r>
-      <w:r>
-        <w:t xml:space="preserve"> </w:t>
-      </w:r>
-      <w:r>
-        <w:t xml:space="preserve">boundary. Near</w:t>
-      </w:r>
-      <w:r>
-        <w:t xml:space="preserve"> </w:t>
-      </w:r>
-      <m:oMath>
-        <m:sSub>
-          <m:e>
-            <m:r>
-              <m:t>t</m:t>
-            </m:r>
-          </m:e>
-          <m:sub>
-            <m:r>
-              <m:t>0</m:t>
-            </m:r>
-          </m:sub>
-        </m:sSub>
-      </m:oMath>
-      <w:r>
-        <w:t xml:space="preserve"> </w:t>
-      </w:r>
-      <w:r>
-        <w:t xml:space="preserve">it drifted to about</w:t>
-      </w:r>
-      <w:r>
-        <w:t xml:space="preserve"> </w:t>
-      </w:r>
-      <m:oMath>
-        <m:r>
-          <m:t>0.49</m:t>
-        </m:r>
-        <m:r>
-          <m:t>K</m:t>
-        </m:r>
-      </m:oMath>
-      <w:r>
-        <w:t xml:space="preserve">, a region few random-start validation paths visit.</w:t>
-      </w:r>
-    </w:p>
-    <w:p>
-      <w:pPr>
-        <w:pStyle w:val="FirstParagraph"/>
-      </w:pPr>
-      <w:r>
-        <w:rPr>
-          <w:bCs/>
-          <w:b/>
-        </w:rPr>
-        <w:t xml:space="preserve">Research connection.</w:t>
-      </w:r>
-    </w:p>
-    <w:p>
-      <w:pPr>
-        <w:numPr>
-          <w:ilvl w:val="0"/>
-          <w:numId w:val="1006"/>
-        </w:numPr>
-        <w:pStyle w:val="Compact"/>
-      </w:pPr>
-      <w:r>
-        <w:rPr>
-          <w:iCs/>
-          <w:i/>
-        </w:rPr>
-        <w:t xml:space="preserve">Becker, Cheridito and Jentzen (2019)</w:t>
-      </w:r>
-      <w:r>
-        <w:t xml:space="preserve"> </w:t>
-      </w:r>
-      <w:r>
-        <w:t xml:space="preserve">decompose a stopping time into 0–1 stop/continue decisions, one network per date. During training each decision is relaxed to a logistic output in</w:t>
-      </w:r>
-      <w:r>
-        <w:t xml:space="preserve"> </w:t>
-      </w:r>
-      <m:oMath>
-        <m:d>
-          <m:dPr>
-            <m:begChr m:val="("/>
-            <m:endChr m:val=")"/>
-            <m:sepChr m:val=""/>
-            <m:grow/>
-          </m:dPr>
-          <m:e>
-            <m:r>
-              <m:t>0</m:t>
-            </m:r>
-            <m:r>
-              <m:rPr>
-                <m:sty m:val="p"/>
-              </m:rPr>
-              <m:t>,</m:t>
-            </m:r>
-            <m:r>
-              <m:t>1</m:t>
-            </m:r>
-          </m:e>
-        </m:d>
-      </m:oMath>
-      <w:r>
-        <w:t xml:space="preserve">, and the networks are trained</w:t>
-      </w:r>
-      <w:r>
-        <w:t xml:space="preserve"> </w:t>
-      </w:r>
-      <w:r>
-        <w:rPr>
-          <w:bCs/>
-          <w:b/>
-        </w:rPr>
-        <w:t xml:space="preserve">backward, one date at a time</w:t>
-      </w:r>
-      <w:r>
-        <w:t xml:space="preserve">. The economic objective is the</w:t>
-      </w:r>
-      <w:r>
-        <w:t xml:space="preserve"> </w:t>
-      </w:r>
-      <w:r>
-        <w:rPr>
-          <w:bCs/>
-          <w:b/>
-        </w:rPr>
-        <w:t xml:space="preserve">optimal-stopping value</w:t>
-      </w:r>
-      <w:r>
-        <w:t xml:space="preserve">: maximise the expected reward of the stopping time. The learned rule gives a lower bound, and a dual martingale gives an upper bound and confidence intervals.</w:t>
-      </w:r>
-    </w:p>
-    <w:p>
-      <w:pPr>
-        <w:numPr>
-          <w:ilvl w:val="0"/>
-          <w:numId w:val="1006"/>
-        </w:numPr>
-        <w:pStyle w:val="Compact"/>
-      </w:pPr>
-      <w:r>
-        <w:rPr>
-          <w:iCs/>
-          <w:i/>
-        </w:rPr>
-        <w:t xml:space="preserve">Bühler et al. (2019)</w:t>
-      </w:r>
-      <w:r>
-        <w:t xml:space="preserve"> </w:t>
-      </w:r>
-      <w:r>
-        <w:t xml:space="preserve">parametrise the</w:t>
-      </w:r>
-      <w:r>
-        <w:t xml:space="preserve"> </w:t>
-      </w:r>
-      <w:r>
-        <w:rPr>
-          <w:bCs/>
-          <w:b/>
-        </w:rPr>
-        <w:t xml:space="preserve">hedging strategy</w:t>
-      </w:r>
-      <w:r>
-        <w:t xml:space="preserve"> </w:t>
-      </w:r>
-      <w:r>
-        <w:t xml:space="preserve">by semi-recurrent networks and train it with mini-batch Adam directly on simulated paths. The economic objective is to</w:t>
-      </w:r>
-      <w:r>
-        <w:t xml:space="preserve"> </w:t>
-      </w:r>
-      <w:r>
-        <w:rPr>
-          <w:bCs/>
-          <w:b/>
-        </w:rPr>
-        <w:t xml:space="preserve">minimise a convex risk measure</w:t>
-      </w:r>
-      <w:r>
-        <w:t xml:space="preserve"> </w:t>
-      </w:r>
-      <w:r>
-        <w:t xml:space="preserve">(e.g. expected shortfall, entropic risk) of the hedged terminal position under frictions such as transaction costs. This gives indifference prices</w:t>
-      </w:r>
-      <w:r>
-        <w:t xml:space="preserve"> </w:t>
-      </w:r>
-      <m:oMath>
-        <m:r>
-          <m:t>p</m:t>
-        </m:r>
-        <m:d>
-          <m:dPr>
-            <m:begChr m:val="("/>
-            <m:endChr m:val=")"/>
-            <m:sepChr m:val=""/>
-            <m:grow/>
-          </m:dPr>
-          <m:e>
-            <m:r>
-              <m:t>Z</m:t>
-            </m:r>
-          </m:e>
-        </m:d>
-        <m:r>
-          <m:rPr>
-            <m:sty m:val="p"/>
-          </m:rPr>
-          <m:t>=</m:t>
-        </m:r>
-        <m:r>
-          <m:t>π</m:t>
-        </m:r>
-        <m:d>
-          <m:dPr>
-            <m:begChr m:val="("/>
-            <m:endChr m:val=")"/>
-            <m:sepChr m:val=""/>
-            <m:grow/>
-          </m:dPr>
-          <m:e>
-            <m:r>
-              <m:rPr>
-                <m:sty m:val="p"/>
-              </m:rPr>
-              <m:t>−</m:t>
-            </m:r>
-            <m:r>
-              <m:t>Z</m:t>
-            </m:r>
-          </m:e>
-        </m:d>
-        <m:r>
-          <m:rPr>
-            <m:sty m:val="p"/>
-          </m:rPr>
-          <m:t>−</m:t>
-        </m:r>
-        <m:r>
-          <m:t>π</m:t>
-        </m:r>
-        <m:d>
-          <m:dPr>
-            <m:begChr m:val="("/>
-            <m:endChr m:val=")"/>
-            <m:sepChr m:val=""/>
-            <m:grow/>
-          </m:dPr>
-          <m:e>
-            <m:r>
-              <m:t>0</m:t>
-            </m:r>
-          </m:e>
-        </m:d>
-      </m:oMath>
-      <w:r>
-        <w:t xml:space="preserve">.</w:t>
-      </w:r>
-    </w:p>
-    <w:p>
-      <w:pPr>
-        <w:numPr>
-          <w:ilvl w:val="0"/>
-          <w:numId w:val="1006"/>
-        </w:numPr>
-        <w:pStyle w:val="Compact"/>
-      </w:pPr>
-      <w:r>
-        <w:t xml:space="preserve">Our payoff stage uses Becker et al.’s relaxation, but on a single threshold parametrisation trained</w:t>
+        <w:t xml:space="preserve">Our payoff stage borrows Becker et al.’s relaxation, applied to one threshold trained</w:t>
       </w:r>
       <w:r>
         <w:t xml:space="preserve"> </w:t>
@@ -7932,7 +7667,7 @@
         <w:t xml:space="preserve">jointly over all dates</w:t>
       </w:r>
       <w:r>
-        <w:t xml:space="preserve">. It is optimised by stochastic gradient on simulated paths, as in deep hedging, but with a risk-neutral</w:t>
+        <w:t xml:space="preserve">, and optimises it on simulated paths as in deep hedging, but for</w:t>
       </w:r>
       <w:r>
         <w:t xml:space="preserve"> </w:t>
@@ -7942,13 +7677,13 @@
           <w:bCs/>
           <w:b/>
         </w:rPr>
-        <w:t xml:space="preserve">expected-payoff</w:t>
-      </w:r>
-      <w:r>
-        <w:t xml:space="preserve"> </w:t>
-      </w:r>
-      <w:r>
-        <w:t xml:space="preserve">objective rather than a risk measure.</w:t>
+        <w:t xml:space="preserve">expected payoff</w:t>
+      </w:r>
+      <w:r>
+        <w:t xml:space="preserve"> </w:t>
+      </w:r>
+      <w:r>
+        <w:t xml:space="preserve">rather than a risk measure.</w:t>
       </w:r>
     </w:p>
     <w:bookmarkEnd w:id="23"/>
@@ -8212,7 +7947,7 @@
               <w:jc w:val="left"/>
             </w:pPr>
             <w:r>
-              <w:t xml:space="preserve">39.1302 (0.039)</w:t>
+              <w:t xml:space="preserve">40.0000 (0.000)</w:t>
             </w:r>
           </w:p>
         </w:tc>
@@ -8286,19 +8021,19 @@
               <w:jc w:val="left"/>
             </w:pPr>
             <w:r>
-              <w:t xml:space="preserve">20.6526 (0.056)</w:t>
-            </w:r>
-          </w:p>
-        </w:tc>
-        <w:tc>
-          <w:tcPr/>
-          <w:p>
-            <w:pPr>
-              <w:pStyle w:val="Compact"/>
-              <w:jc w:val="left"/>
-            </w:pPr>
-            <w:r>
-              <w:t xml:space="preserve">20.5836 (0.056)</w:t>
+              <w:t xml:space="preserve">20.6611 (0.056)</w:t>
+            </w:r>
+          </w:p>
+        </w:tc>
+        <w:tc>
+          <w:tcPr/>
+          <w:p>
+            <w:pPr>
+              <w:pStyle w:val="Compact"/>
+              <w:jc w:val="left"/>
+            </w:pPr>
+            <w:r>
+              <w:t xml:space="preserve">20.6321 (0.056)</w:t>
             </w:r>
           </w:p>
         </w:tc>
@@ -8372,19 +8107,19 @@
               <w:jc w:val="left"/>
             </w:pPr>
             <w:r>
-              <w:t xml:space="preserve">8.6484 (0.050)</w:t>
-            </w:r>
-          </w:p>
-        </w:tc>
-        <w:tc>
-          <w:tcPr/>
-          <w:p>
-            <w:pPr>
-              <w:pStyle w:val="Compact"/>
-              <w:jc w:val="left"/>
-            </w:pPr>
-            <w:r>
-              <w:t xml:space="preserve">8.7598 (0.046)</w:t>
+              <w:t xml:space="preserve">8.6398 (0.050)</w:t>
+            </w:r>
+          </w:p>
+        </w:tc>
+        <w:tc>
+          <w:tcPr/>
+          <w:p>
+            <w:pPr>
+              <w:pStyle w:val="Compact"/>
+              <w:jc w:val="left"/>
+            </w:pPr>
+            <w:r>
+              <w:t xml:space="preserve">8.6232 (0.050)</w:t>
             </w:r>
           </w:p>
         </w:tc>
@@ -8470,7 +8205,7 @@
               <w:jc w:val="left"/>
             </w:pPr>
             <w:r>
-              <w:t xml:space="preserve">39.9710 (0.010)</w:t>
+              <w:t xml:space="preserve">40.0000 (0.000)</w:t>
             </w:r>
           </w:p>
         </w:tc>
@@ -8532,31 +8267,31 @@
               <w:jc w:val="left"/>
             </w:pPr>
             <w:r>
-              <w:t xml:space="preserve">22.1095</w:t>
-            </w:r>
-          </w:p>
-        </w:tc>
-        <w:tc>
-          <w:tcPr/>
-          <w:p>
-            <w:pPr>
-              <w:pStyle w:val="Compact"/>
-              <w:jc w:val="left"/>
-            </w:pPr>
-            <w:r>
-              <w:t xml:space="preserve">21.9971 (0.063)</w:t>
-            </w:r>
-          </w:p>
-        </w:tc>
-        <w:tc>
-          <w:tcPr/>
-          <w:p>
-            <w:pPr>
-              <w:pStyle w:val="Compact"/>
-              <w:jc w:val="left"/>
-            </w:pPr>
-            <w:r>
-              <w:t xml:space="preserve">22.0096 (0.063)</w:t>
+              <w:t xml:space="preserve">22.1096</w:t>
+            </w:r>
+          </w:p>
+        </w:tc>
+        <w:tc>
+          <w:tcPr/>
+          <w:p>
+            <w:pPr>
+              <w:pStyle w:val="Compact"/>
+              <w:jc w:val="left"/>
+            </w:pPr>
+            <w:r>
+              <w:t xml:space="preserve">22.0170 (0.062)</w:t>
+            </w:r>
+          </w:p>
+        </w:tc>
+        <w:tc>
+          <w:tcPr/>
+          <w:p>
+            <w:pPr>
+              <w:pStyle w:val="Compact"/>
+              <w:jc w:val="left"/>
+            </w:pPr>
+            <w:r>
+              <w:t xml:space="preserve">22.0286 (0.058)</w:t>
             </w:r>
           </w:p>
         </w:tc>
@@ -8630,19 +8365,19 @@
               <w:jc w:val="left"/>
             </w:pPr>
             <w:r>
-              <w:t xml:space="preserve">10.0287 (0.055)</w:t>
-            </w:r>
-          </w:p>
-        </w:tc>
-        <w:tc>
-          <w:tcPr/>
-          <w:p>
-            <w:pPr>
-              <w:pStyle w:val="Compact"/>
-              <w:jc w:val="left"/>
-            </w:pPr>
-            <w:r>
-              <w:t xml:space="preserve">10.0334 (0.055)</w:t>
+              <w:t xml:space="preserve">10.0426 (0.054)</w:t>
+            </w:r>
+          </w:p>
+        </w:tc>
+        <w:tc>
+          <w:tcPr/>
+          <w:p>
+            <w:pPr>
+              <w:pStyle w:val="Compact"/>
+              <w:jc w:val="left"/>
+            </w:pPr>
+            <w:r>
+              <w:t xml:space="preserve">10.0477 (0.053)</w:t>
             </w:r>
           </w:p>
         </w:tc>
@@ -8802,19 +8537,19 @@
               <w:jc w:val="left"/>
             </w:pPr>
             <w:r>
-              <w:t xml:space="preserve">20.6604 (0.054)</w:t>
-            </w:r>
-          </w:p>
-        </w:tc>
-        <w:tc>
-          <w:tcPr/>
-          <w:p>
-            <w:pPr>
-              <w:pStyle w:val="Compact"/>
-              <w:jc w:val="left"/>
-            </w:pPr>
-            <w:r>
-              <w:t xml:space="preserve">20.8215 (0.042)</w:t>
+              <w:t xml:space="preserve">20.6009 (0.055)</w:t>
+            </w:r>
+          </w:p>
+        </w:tc>
+        <w:tc>
+          <w:tcPr/>
+          <w:p>
+            <w:pPr>
+              <w:pStyle w:val="Compact"/>
+              <w:jc w:val="left"/>
+            </w:pPr>
+            <w:r>
+              <w:t xml:space="preserve">20.6331 (0.055)</w:t>
             </w:r>
           </w:p>
         </w:tc>
@@ -8888,19 +8623,19 @@
               <w:jc w:val="left"/>
             </w:pPr>
             <w:r>
-              <w:t xml:space="preserve">8.6117 (0.049)</w:t>
-            </w:r>
-          </w:p>
-        </w:tc>
-        <w:tc>
-          <w:tcPr/>
-          <w:p>
-            <w:pPr>
-              <w:pStyle w:val="Compact"/>
-              <w:jc w:val="left"/>
-            </w:pPr>
-            <w:r>
-              <w:t xml:space="preserve">8.6885 (0.046)</w:t>
+              <w:t xml:space="preserve">8.5857 (0.050)</w:t>
+            </w:r>
+          </w:p>
+        </w:tc>
+        <w:tc>
+          <w:tcPr/>
+          <w:p>
+            <w:pPr>
+              <w:pStyle w:val="Compact"/>
+              <w:jc w:val="left"/>
+            </w:pPr>
+            <w:r>
+              <w:t xml:space="preserve">8.5934 (0.050)</w:t>
             </w:r>
           </w:p>
         </w:tc>
@@ -8986,7 +8721,7 @@
               <w:jc w:val="left"/>
             </w:pPr>
             <w:r>
-              <w:t xml:space="preserve">40.0000 (0.000)</w:t>
+              <w:t xml:space="preserve">39.9550 (0.021)</w:t>
             </w:r>
           </w:p>
         </w:tc>
@@ -9060,19 +8795,19 @@
               <w:jc w:val="left"/>
             </w:pPr>
             <w:r>
-              <w:t xml:space="preserve">22.0697 (0.063)</w:t>
-            </w:r>
-          </w:p>
-        </w:tc>
-        <w:tc>
-          <w:tcPr/>
-          <w:p>
-            <w:pPr>
-              <w:pStyle w:val="Compact"/>
-              <w:jc w:val="left"/>
-            </w:pPr>
-            <w:r>
-              <w:t xml:space="preserve">22.0652 (0.062)</w:t>
+              <w:t xml:space="preserve">22.0870 (0.063)</w:t>
+            </w:r>
+          </w:p>
+        </w:tc>
+        <w:tc>
+          <w:tcPr/>
+          <w:p>
+            <w:pPr>
+              <w:pStyle w:val="Compact"/>
+              <w:jc w:val="left"/>
+            </w:pPr>
+            <w:r>
+              <w:t xml:space="preserve">22.0273 (0.055)</w:t>
             </w:r>
           </w:p>
         </w:tc>
@@ -9146,19 +8881,19 @@
               <w:jc w:val="left"/>
             </w:pPr>
             <w:r>
-              <w:t xml:space="preserve">10.0733 (0.055)</w:t>
-            </w:r>
-          </w:p>
-        </w:tc>
-        <w:tc>
-          <w:tcPr/>
-          <w:p>
-            <w:pPr>
-              <w:pStyle w:val="Compact"/>
-              <w:jc w:val="left"/>
-            </w:pPr>
-            <w:r>
-              <w:t xml:space="preserve">10.0726 (0.055)</w:t>
+              <w:t xml:space="preserve">10.0716 (0.055)</w:t>
+            </w:r>
+          </w:p>
+        </w:tc>
+        <w:tc>
+          <w:tcPr/>
+          <w:p>
+            <w:pPr>
+              <w:pStyle w:val="Compact"/>
+              <w:jc w:val="left"/>
+            </w:pPr>
+            <w:r>
+              <w:t xml:space="preserve">10.0685 (0.052)</w:t>
             </w:r>
           </w:p>
         </w:tc>
@@ -9299,7 +9034,7 @@
         <w:t xml:space="preserve"> </w:t>
       </w:r>
       <w:r>
-        <w:t xml:space="preserve">is -0.65. Interval endpoints are in</w:t>
+        <w:t xml:space="preserve">is -0.37. Interval endpoints are in</w:t>
       </w:r>
       <w:r>
         <w:t xml:space="preserve"> </w:t>
@@ -9376,24 +9111,24 @@
       <w:pPr>
         <w:numPr>
           <w:ilvl w:val="0"/>
-          <w:numId w:val="1007"/>
+          <w:numId w:val="1005"/>
         </w:numPr>
         <w:pStyle w:val="Compact"/>
       </w:pPr>
       <w:r>
-        <w:t xml:space="preserve">LS loses 0.02–0.19 $ and the NN loses 0.01–0.26 $.</w:t>
+        <w:t xml:space="preserve">LS loses 0.02–0.25 $ and the NN loses 0.01–0.22 $.</w:t>
       </w:r>
     </w:p>
     <w:p>
       <w:pPr>
         <w:numPr>
           <w:ilvl w:val="0"/>
-          <w:numId w:val="1007"/>
+          <w:numId w:val="1005"/>
         </w:numPr>
         <w:pStyle w:val="Compact"/>
       </w:pPr>
       <w:r>
-        <w:t xml:space="preserve">The NN beats LS in case 2 (0.03 vs 0.19 $ at</w:t>
+        <w:t xml:space="preserve">At</w:t>
       </w:r>
       <w:r>
         <w:t xml:space="preserve"> </w:t>
@@ -9422,14 +9157,50 @@
         </m:r>
       </m:oMath>
       <w:r>
-        <w:t xml:space="preserve">) and ties LS in cases 1 and 3.</w:t>
+        <w:t xml:space="preserve">, NN vs LS:</w:t>
+      </w:r>
+    </w:p>
+    <w:p>
+      <w:pPr>
+        <w:numPr>
+          <w:ilvl w:val="1"/>
+          <w:numId w:val="1006"/>
+        </w:numPr>
+        <w:pStyle w:val="Compact"/>
+      </w:pPr>
+      <w:r>
+        <w:t xml:space="preserve">the NN beats LS in case 2 by 0.032 $ (SE 0.014);</w:t>
+      </w:r>
+    </w:p>
+    <w:p>
+      <w:pPr>
+        <w:numPr>
+          <w:ilvl w:val="1"/>
+          <w:numId w:val="1006"/>
+        </w:numPr>
+        <w:pStyle w:val="Compact"/>
+      </w:pPr>
+      <w:r>
+        <w:t xml:space="preserve">LS beats the NN in case 0 by 0.029 $ (SE 0.010) and in case 3 by 0.060 $ (SE 0.031);</w:t>
+      </w:r>
+    </w:p>
+    <w:p>
+      <w:pPr>
+        <w:numPr>
+          <w:ilvl w:val="1"/>
+          <w:numId w:val="1006"/>
+        </w:numPr>
+        <w:pStyle w:val="Compact"/>
+      </w:pPr>
+      <w:r>
+        <w:t xml:space="preserve">the two tie in case 1.</w:t>
       </w:r>
     </w:p>
     <w:p>
       <w:pPr>
         <w:numPr>
           <w:ilvl w:val="0"/>
-          <w:numId w:val="1007"/>
+          <w:numId w:val="1005"/>
         </w:numPr>
         <w:pStyle w:val="Compact"/>
       </w:pPr>
@@ -9466,7 +9237,7 @@
         <w:t xml:space="preserve"> </w:t>
       </w:r>
       <w:r>
-        <w:t xml:space="preserve">the NN loses 0.87 $ in case 0 and 0.03 $ in case 1, because its</w:t>
+        <w:t xml:space="preserve">every policy exercises at once except the case-3 NN. Its</w:t>
       </w:r>
       <w:r>
         <w:t xml:space="preserve"> </w:t>
@@ -9489,7 +9260,7 @@
         <w:t xml:space="preserve"> </w:t>
       </w:r>
       <w:r>
-        <w:t xml:space="preserve">boundary sits below 60, so it waits instead of exercising.</w:t>
+        <w:t xml:space="preserve">boundary sits just below 60, so it waits, and loses 0.045 $ (SE 0.021).</w:t>
       </w:r>
     </w:p>
     <w:p>
@@ -9764,43 +9535,43 @@
               <w:jc w:val="left"/>
             </w:pPr>
             <w:r>
-              <w:t xml:space="preserve">0.065</w:t>
-            </w:r>
-          </w:p>
-        </w:tc>
-        <w:tc>
-          <w:tcPr/>
-          <w:p>
-            <w:pPr>
-              <w:pStyle w:val="Compact"/>
-              <w:jc w:val="left"/>
-            </w:pPr>
-            <w:r>
-              <w:t xml:space="preserve">0.165</w:t>
-            </w:r>
-          </w:p>
-        </w:tc>
-        <w:tc>
-          <w:tcPr/>
-          <w:p>
-            <w:pPr>
-              <w:pStyle w:val="Compact"/>
-              <w:jc w:val="left"/>
-            </w:pPr>
-            <w:r>
-              <w:t xml:space="preserve">0.078</w:t>
-            </w:r>
-          </w:p>
-        </w:tc>
-        <w:tc>
-          <w:tcPr/>
-          <w:p>
-            <w:pPr>
-              <w:pStyle w:val="Compact"/>
-              <w:jc w:val="left"/>
-            </w:pPr>
-            <w:r>
-              <w:t xml:space="preserve">0.229</w:t>
+              <w:t xml:space="preserve">0.069</w:t>
+            </w:r>
+          </w:p>
+        </w:tc>
+        <w:tc>
+          <w:tcPr/>
+          <w:p>
+            <w:pPr>
+              <w:pStyle w:val="Compact"/>
+              <w:jc w:val="left"/>
+            </w:pPr>
+            <w:r>
+              <w:t xml:space="preserve">0.204</w:t>
+            </w:r>
+          </w:p>
+        </w:tc>
+        <w:tc>
+          <w:tcPr/>
+          <w:p>
+            <w:pPr>
+              <w:pStyle w:val="Compact"/>
+              <w:jc w:val="left"/>
+            </w:pPr>
+            <w:r>
+              <w:t xml:space="preserve">0.072</w:t>
+            </w:r>
+          </w:p>
+        </w:tc>
+        <w:tc>
+          <w:tcPr/>
+          <w:p>
+            <w:pPr>
+              <w:pStyle w:val="Compact"/>
+              <w:jc w:val="left"/>
+            </w:pPr>
+            <w:r>
+              <w:t xml:space="preserve">0.222</w:t>
             </w:r>
           </w:p>
         </w:tc>
@@ -9850,43 +9621,43 @@
               <w:jc w:val="left"/>
             </w:pPr>
             <w:r>
-              <w:t xml:space="preserve">0.032</w:t>
-            </w:r>
-          </w:p>
-        </w:tc>
-        <w:tc>
-          <w:tcPr/>
-          <w:p>
-            <w:pPr>
-              <w:pStyle w:val="Compact"/>
-              <w:jc w:val="left"/>
-            </w:pPr>
-            <w:r>
-              <w:t xml:space="preserve">0.235</w:t>
-            </w:r>
-          </w:p>
-        </w:tc>
-        <w:tc>
-          <w:tcPr/>
-          <w:p>
-            <w:pPr>
-              <w:pStyle w:val="Compact"/>
-              <w:jc w:val="left"/>
-            </w:pPr>
-            <w:r>
-              <w:t xml:space="preserve">0.019</w:t>
-            </w:r>
-          </w:p>
-        </w:tc>
-        <w:tc>
-          <w:tcPr/>
-          <w:p>
-            <w:pPr>
-              <w:pStyle w:val="Compact"/>
-              <w:jc w:val="left"/>
-            </w:pPr>
-            <w:r>
-              <w:t xml:space="preserve">0.165</w:t>
+              <w:t xml:space="preserve">0.034</w:t>
+            </w:r>
+          </w:p>
+        </w:tc>
+        <w:tc>
+          <w:tcPr/>
+          <w:p>
+            <w:pPr>
+              <w:pStyle w:val="Compact"/>
+              <w:jc w:val="left"/>
+            </w:pPr>
+            <w:r>
+              <w:t xml:space="preserve">0.237</w:t>
+            </w:r>
+          </w:p>
+        </w:tc>
+        <w:tc>
+          <w:tcPr/>
+          <w:p>
+            <w:pPr>
+              <w:pStyle w:val="Compact"/>
+              <w:jc w:val="left"/>
+            </w:pPr>
+            <w:r>
+              <w:t xml:space="preserve">0.017</w:t>
+            </w:r>
+          </w:p>
+        </w:tc>
+        <w:tc>
+          <w:tcPr/>
+          <w:p>
+            <w:pPr>
+              <w:pStyle w:val="Compact"/>
+              <w:jc w:val="left"/>
+            </w:pPr>
+            <w:r>
+              <w:t xml:space="preserve">0.155</w:t>
             </w:r>
           </w:p>
         </w:tc>
@@ -9936,43 +9707,43 @@
               <w:jc w:val="left"/>
             </w:pPr>
             <w:r>
-              <w:t xml:space="preserve">0.055</w:t>
-            </w:r>
-          </w:p>
-        </w:tc>
-        <w:tc>
-          <w:tcPr/>
-          <w:p>
-            <w:pPr>
-              <w:pStyle w:val="Compact"/>
-              <w:jc w:val="left"/>
-            </w:pPr>
-            <w:r>
-              <w:t xml:space="preserve">0.199</w:t>
-            </w:r>
-          </w:p>
-        </w:tc>
-        <w:tc>
-          <w:tcPr/>
-          <w:p>
-            <w:pPr>
-              <w:pStyle w:val="Compact"/>
-              <w:jc w:val="left"/>
-            </w:pPr>
-            <w:r>
-              <w:t xml:space="preserve">0.023</w:t>
-            </w:r>
-          </w:p>
-        </w:tc>
-        <w:tc>
-          <w:tcPr/>
-          <w:p>
-            <w:pPr>
-              <w:pStyle w:val="Compact"/>
-              <w:jc w:val="left"/>
-            </w:pPr>
-            <w:r>
-              <w:t xml:space="preserve">0.166</w:t>
+              <w:t xml:space="preserve">0.064</w:t>
+            </w:r>
+          </w:p>
+        </w:tc>
+        <w:tc>
+          <w:tcPr/>
+          <w:p>
+            <w:pPr>
+              <w:pStyle w:val="Compact"/>
+              <w:jc w:val="left"/>
+            </w:pPr>
+            <w:r>
+              <w:t xml:space="preserve">0.219</w:t>
+            </w:r>
+          </w:p>
+        </w:tc>
+        <w:tc>
+          <w:tcPr/>
+          <w:p>
+            <w:pPr>
+              <w:pStyle w:val="Compact"/>
+              <w:jc w:val="left"/>
+            </w:pPr>
+            <w:r>
+              <w:t xml:space="preserve">0.062</w:t>
+            </w:r>
+          </w:p>
+        </w:tc>
+        <w:tc>
+          <w:tcPr/>
+          <w:p>
+            <w:pPr>
+              <w:pStyle w:val="Compact"/>
+              <w:jc w:val="left"/>
+            </w:pPr>
+            <w:r>
+              <w:t xml:space="preserve">0.220</w:t>
             </w:r>
           </w:p>
         </w:tc>
@@ -10022,19 +9793,19 @@
               <w:jc w:val="left"/>
             </w:pPr>
             <w:r>
-              <w:t xml:space="preserve">0.047</w:t>
-            </w:r>
-          </w:p>
-        </w:tc>
-        <w:tc>
-          <w:tcPr/>
-          <w:p>
-            <w:pPr>
-              <w:pStyle w:val="Compact"/>
-              <w:jc w:val="left"/>
-            </w:pPr>
-            <w:r>
-              <w:t xml:space="preserve">0.388</w:t>
+              <w:t xml:space="preserve">0.037</w:t>
+            </w:r>
+          </w:p>
+        </w:tc>
+        <w:tc>
+          <w:tcPr/>
+          <w:p>
+            <w:pPr>
+              <w:pStyle w:val="Compact"/>
+              <w:jc w:val="left"/>
+            </w:pPr>
+            <w:r>
+              <w:t xml:space="preserve">0.292</w:t>
             </w:r>
           </w:p>
         </w:tc>
@@ -10058,7 +9829,7 @@
               <w:jc w:val="left"/>
             </w:pPr>
             <w:r>
-              <w:t xml:space="preserve">0.229</w:t>
+              <w:t xml:space="preserve">0.173</w:t>
             </w:r>
           </w:p>
         </w:tc>
@@ -10189,7 +9960,7 @@
         </m:r>
       </m:oMath>
       <w:r>
-        <w:t xml:space="preserve">. The fitted errors are 10–100 times larger (LS 0.032–0.065, NN 0.019–0.078). So every change in a fitted policy with</w:t>
+        <w:t xml:space="preserve">. The fitted errors are 7–90 times larger (LS 0.034–0.069, NN 0.017–0.072). So a fitted policy’s change with</w:t>
       </w:r>
       <w:r>
         <w:t xml:space="preserve"> </w:t>
@@ -10203,7 +9974,7 @@
         <w:t xml:space="preserve"> </w:t>
       </w:r>
       <w:r>
-        <w:t xml:space="preserve">is learning error, set by the fixed budgets and by checkpoint selection, not by the extra exercise dates.</w:t>
+        <w:t xml:space="preserve">is learning error (fixed budgets, checkpoint selection), not the extra exercise dates.</w:t>
       </w:r>
     </w:p>
     <w:p>
@@ -10221,7 +9992,7 @@
         <w:t xml:space="preserve"> </w:t>
       </w:r>
       <w:r>
-        <w:t xml:space="preserve">Mean boundary errors of 2–8% of</w:t>
+        <w:t xml:space="preserve">Mean boundary errors of 2–7% of</w:t>
       </w:r>
       <w:r>
         <w:t xml:space="preserve"> </w:t>
@@ -10235,36 +10006,7 @@
         <w:t xml:space="preserve"> </w:t>
       </w:r>
       <w:r>
-        <w:t xml:space="preserve">cost only cents in price. The one large loss (case 0,</w:t>
-      </w:r>
-      <w:r>
-        <w:t xml:space="preserve"> </w:t>
-      </w:r>
-      <m:oMath>
-        <m:sSub>
-          <m:e>
-            <m:r>
-              <m:t>S</m:t>
-            </m:r>
-          </m:e>
-          <m:sub>
-            <m:r>
-              <m:t>0</m:t>
-            </m:r>
-          </m:sub>
-        </m:sSub>
-        <m:r>
-          <m:rPr>
-            <m:sty m:val="p"/>
-          </m:rPr>
-          <m:t>=</m:t>
-        </m:r>
-        <m:r>
-          <m:t>60</m:t>
-        </m:r>
-      </m:oMath>
-      <w:r>
-        <w:t xml:space="preserve">) comes from an error at a single, heavily visited state rather than a large average error.</w:t>
+        <w:t xml:space="preserve">cost at most about 0.25 $ in price, and usually a few cents. The two need not rank policies alike: in case 3 the NN has the smaller maximum error but the larger price loss, because what matters is the error where paths decide.</w:t>
       </w:r>
     </w:p>
     <w:p>
@@ -10529,31 +10271,31 @@
               <w:jc w:val="left"/>
             </w:pPr>
             <w:r>
-              <w:t xml:space="preserve">-0.0191</w:t>
-            </w:r>
-          </w:p>
-        </w:tc>
-        <w:tc>
-          <w:tcPr/>
-          <w:p>
-            <w:pPr>
-              <w:pStyle w:val="Compact"/>
-              <w:jc w:val="left"/>
-            </w:pPr>
-            <w:r>
-              <w:t xml:space="preserve">0.0081</w:t>
-            </w:r>
-          </w:p>
-        </w:tc>
-        <w:tc>
-          <w:tcPr/>
-          <w:p>
-            <w:pPr>
-              <w:pStyle w:val="Compact"/>
-              <w:jc w:val="left"/>
-            </w:pPr>
-            <w:r>
-              <w:t xml:space="preserve">-0.0194</w:t>
+              <w:t xml:space="preserve">+0.0218</w:t>
+            </w:r>
+          </w:p>
+        </w:tc>
+        <w:tc>
+          <w:tcPr/>
+          <w:p>
+            <w:pPr>
+              <w:pStyle w:val="Compact"/>
+              <w:jc w:val="left"/>
+            </w:pPr>
+            <w:r>
+              <w:t xml:space="preserve">0.0105</w:t>
+            </w:r>
+          </w:p>
+        </w:tc>
+        <w:tc>
+          <w:tcPr/>
+          <w:p>
+            <w:pPr>
+              <w:pStyle w:val="Compact"/>
+              <w:jc w:val="left"/>
+            </w:pPr>
+            <w:r>
+              <w:t xml:space="preserve">-0.0197</w:t>
             </w:r>
           </w:p>
         </w:tc>
@@ -10577,7 +10319,7 @@
               <w:jc w:val="left"/>
             </w:pPr>
             <w:r>
-              <w:t xml:space="preserve">17.5% (all later)</w:t>
+              <w:t xml:space="preserve">21.8% (all later)</w:t>
             </w:r>
           </w:p>
         </w:tc>
@@ -10603,55 +10345,55 @@
               <w:jc w:val="left"/>
             </w:pPr>
             <w:r>
-              <w:t xml:space="preserve">+0.0046</w:t>
-            </w:r>
-          </w:p>
-        </w:tc>
-        <w:tc>
-          <w:tcPr/>
-          <w:p>
-            <w:pPr>
-              <w:pStyle w:val="Compact"/>
-              <w:jc w:val="left"/>
-            </w:pPr>
-            <w:r>
-              <w:t xml:space="preserve">0.0090</w:t>
-            </w:r>
-          </w:p>
-        </w:tc>
-        <w:tc>
-          <w:tcPr/>
-          <w:p>
-            <w:pPr>
-              <w:pStyle w:val="Compact"/>
-              <w:jc w:val="left"/>
-            </w:pPr>
-            <w:r>
-              <w:t xml:space="preserve">+0.0135</w:t>
-            </w:r>
-          </w:p>
-        </w:tc>
-        <w:tc>
-          <w:tcPr/>
-          <w:p>
-            <w:pPr>
-              <w:pStyle w:val="Compact"/>
-              <w:jc w:val="left"/>
-            </w:pPr>
-            <w:r>
-              <w:t xml:space="preserve">147 of 360</w:t>
-            </w:r>
-          </w:p>
-        </w:tc>
-        <w:tc>
-          <w:tcPr/>
-          <w:p>
-            <w:pPr>
-              <w:pStyle w:val="Compact"/>
-              <w:jc w:val="left"/>
-            </w:pPr>
-            <w:r>
-              <w:t xml:space="preserve">19.4% (all earlier)</w:t>
+              <w:t xml:space="preserve">-0.0162</w:t>
+            </w:r>
+          </w:p>
+        </w:tc>
+        <w:tc>
+          <w:tcPr/>
+          <w:p>
+            <w:pPr>
+              <w:pStyle w:val="Compact"/>
+              <w:jc w:val="left"/>
+            </w:pPr>
+            <w:r>
+              <w:t xml:space="preserve">0.0114</w:t>
+            </w:r>
+          </w:p>
+        </w:tc>
+        <w:tc>
+          <w:tcPr/>
+          <w:p>
+            <w:pPr>
+              <w:pStyle w:val="Compact"/>
+              <w:jc w:val="left"/>
+            </w:pPr>
+            <w:r>
+              <w:t xml:space="preserve">+0.0134</w:t>
+            </w:r>
+          </w:p>
+        </w:tc>
+        <w:tc>
+          <w:tcPr/>
+          <w:p>
+            <w:pPr>
+              <w:pStyle w:val="Compact"/>
+              <w:jc w:val="left"/>
+            </w:pPr>
+            <w:r>
+              <w:t xml:space="preserve">148 of 360</w:t>
+            </w:r>
+          </w:p>
+        </w:tc>
+        <w:tc>
+          <w:tcPr/>
+          <w:p>
+            <w:pPr>
+              <w:pStyle w:val="Compact"/>
+              <w:jc w:val="left"/>
+            </w:pPr>
+            <w:r>
+              <w:t xml:space="preserve">23.9% (all earlier)</w:t>
             </w:r>
           </w:p>
         </w:tc>
@@ -10669,7 +10411,7 @@
       <w:pPr>
         <w:numPr>
           <w:ilvl w:val="0"/>
-          <w:numId w:val="1008"/>
+          <w:numId w:val="1007"/>
         </w:numPr>
         <w:pStyle w:val="Compact"/>
       </w:pPr>
@@ -10684,15 +10426,9 @@
         <w:t xml:space="preserve"> </w:t>
       </w:r>
       <w:r>
-        <w:t xml:space="preserve">It absorbs most of the upward shift: 147 dates are capped, so the applied mean shift is only</w:t>
-      </w:r>
-      <w:r>
-        <w:t xml:space="preserve"> </w:t>
-      </w:r>
-      <m:oMath>
-        <m:r>
-          <m:t>0.014</m:t>
-        </m:r>
+        <w:t xml:space="preserve">It absorbs much of the upward shift: 148 dates are capped, so the applied mean shift is only 0.013</w:t>
+      </w:r>
+      <m:oMath>
         <m:r>
           <m:t>K</m:t>
         </m:r>
@@ -10705,7 +10441,7 @@
       <w:pPr>
         <w:numPr>
           <w:ilvl w:val="0"/>
-          <w:numId w:val="1008"/>
+          <w:numId w:val="1007"/>
         </w:numPr>
         <w:pStyle w:val="Compact"/>
       </w:pPr>
@@ -10720,14 +10456,69 @@
         <w:t xml:space="preserve"> </w:t>
       </w:r>
       <w:r>
-        <w:t xml:space="preserve">Only paths that enter the shifted band change decision, about 17–19% of paths.</w:t>
+        <w:t xml:space="preserve">Only paths that enter the shifted band change decision: 22% of paths for</w:t>
+      </w:r>
+      <w:r>
+        <w:t xml:space="preserve"> </w:t>
+      </w:r>
+      <m:oMath>
+        <m:r>
+          <m:t>a</m:t>
+        </m:r>
+        <m:r>
+          <m:rPr>
+            <m:sty m:val="p"/>
+          </m:rPr>
+          <m:t>=</m:t>
+        </m:r>
+        <m:r>
+          <m:rPr>
+            <m:sty m:val="p"/>
+          </m:rPr>
+          <m:t>−</m:t>
+        </m:r>
+        <m:r>
+          <m:t>0.02</m:t>
+        </m:r>
+      </m:oMath>
+      <w:r>
+        <w:t xml:space="preserve"> </w:t>
+      </w:r>
+      <w:r>
+        <w:t xml:space="preserve">and 24% for</w:t>
+      </w:r>
+      <w:r>
+        <w:t xml:space="preserve"> </w:t>
+      </w:r>
+      <m:oMath>
+        <m:r>
+          <m:t>a</m:t>
+        </m:r>
+        <m:r>
+          <m:rPr>
+            <m:sty m:val="p"/>
+          </m:rPr>
+          <m:t>=</m:t>
+        </m:r>
+        <m:r>
+          <m:rPr>
+            <m:sty m:val="p"/>
+          </m:rPr>
+          <m:t>+</m:t>
+        </m:r>
+        <m:r>
+          <m:t>0.02</m:t>
+        </m:r>
+      </m:oMath>
+      <w:r>
+        <w:t xml:space="preserve">.</w:t>
       </w:r>
     </w:p>
     <w:p>
       <w:pPr>
         <w:numPr>
           <w:ilvl w:val="0"/>
-          <w:numId w:val="1008"/>
+          <w:numId w:val="1007"/>
         </w:numPr>
         <w:pStyle w:val="Compact"/>
       </w:pPr>
@@ -10738,11 +10529,45 @@
         </w:rPr>
         <w:t xml:space="preserve">Direction of the change.</w:t>
       </w:r>
-      <w:r>
-        <w:t xml:space="preserve"> </w:t>
-      </w:r>
-      <w:r>
-        <w:t xml:space="preserve">Lowering the boundary delays exercise and costs -0.019 $ (SE 0.008; -0.110 $ per affected path). Raising it gains +0.005 $ (SE 0.009), which is not significant.</w:t>
+    </w:p>
+    <w:p>
+      <w:pPr>
+        <w:numPr>
+          <w:ilvl w:val="1"/>
+          <w:numId w:val="1008"/>
+        </w:numPr>
+        <w:pStyle w:val="Compact"/>
+      </w:pPr>
+      <w:r>
+        <w:t xml:space="preserve">Lowering the boundary delays exercise and</w:t>
+      </w:r>
+      <w:r>
+        <w:t xml:space="preserve"> </w:t>
+      </w:r>
+      <w:r>
+        <w:rPr>
+          <w:iCs/>
+          <w:i/>
+        </w:rPr>
+        <w:t xml:space="preserve">gains</w:t>
+      </w:r>
+      <w:r>
+        <w:t xml:space="preserve"> </w:t>
+      </w:r>
+      <w:r>
+        <w:t xml:space="preserve">+0.022 $ (SE 0.011; +0.100 $ per affected path).</w:t>
+      </w:r>
+    </w:p>
+    <w:p>
+      <w:pPr>
+        <w:numPr>
+          <w:ilvl w:val="1"/>
+          <w:numId w:val="1008"/>
+        </w:numPr>
+        <w:pStyle w:val="Compact"/>
+      </w:pPr>
+      <w:r>
+        <w:t xml:space="preserve">Raising it makes those paths exercise earlier and changes the price by -0.016 $ (SE 0.011).</w:t>
       </w:r>
     </w:p>
     <w:p>
@@ -10750,14 +10575,14 @@
         <w:pStyle w:val="FirstParagraph"/>
       </w:pPr>
       <w:r>
-        <w:t xml:space="preserve">The asymmetry arises because the NN sits about</w:t>
-      </w:r>
-      <w:r>
-        <w:t xml:space="preserve"> </w:t>
-      </w:r>
-      <m:oMath>
-        <m:r>
-          <m:t>0.04</m:t>
+        <w:t xml:space="preserve">The sign pattern follows where the NN is wrong along the paths. It lies</w:t>
+      </w:r>
+      <w:r>
+        <w:t xml:space="preserve"> </w:t>
+      </w:r>
+      <m:oMath>
+        <m:r>
+          <m:t>0.031</m:t>
         </m:r>
         <m:r>
           <m:t>K</m:t>
@@ -10767,7 +10592,73 @@
         <w:t xml:space="preserve"> </w:t>
       </w:r>
       <w:r>
-        <w:t xml:space="preserve">below the reference: moving down goes further from the optimum, while moving up approaches it on the flat part of the value surface. A finer sweep (in the code) shows the price is flat within noise for</w:t>
+        <w:t xml:space="preserve">below the reference on average, but overshoots by up to</w:t>
+      </w:r>
+      <w:r>
+        <w:t xml:space="preserve"> </w:t>
+      </w:r>
+      <m:oMath>
+        <m:r>
+          <m:t>0.08</m:t>
+        </m:r>
+        <m:r>
+          <m:t>K</m:t>
+        </m:r>
+      </m:oMath>
+      <w:r>
+        <w:t xml:space="preserve"> </w:t>
+      </w:r>
+      <w:r>
+        <w:t xml:space="preserve">just after</w:t>
+      </w:r>
+      <w:r>
+        <w:t xml:space="preserve"> </w:t>
+      </w:r>
+      <m:oMath>
+        <m:sSub>
+          <m:e>
+            <m:r>
+              <m:t>d</m:t>
+            </m:r>
+          </m:e>
+          <m:sub>
+            <m:r>
+              <m:t>1</m:t>
+            </m:r>
+          </m:sub>
+        </m:sSub>
+      </m:oMath>
+      <w:r>
+        <w:t xml:space="preserve">. The gain from lowering it is consistent with those early-exercise errors dominating at</w:t>
+      </w:r>
+      <w:r>
+        <w:t xml:space="preserve"> </w:t>
+      </w:r>
+      <m:oMath>
+        <m:sSub>
+          <m:e>
+            <m:r>
+              <m:t>S</m:t>
+            </m:r>
+          </m:e>
+          <m:sub>
+            <m:r>
+              <m:t>0</m:t>
+            </m:r>
+          </m:sub>
+        </m:sSub>
+        <m:r>
+          <m:rPr>
+            <m:sty m:val="p"/>
+          </m:rPr>
+          <m:t>=</m:t>
+        </m:r>
+        <m:r>
+          <m:t>100</m:t>
+        </m:r>
+      </m:oMath>
+      <w:r>
+        <w:t xml:space="preserve">. Our finer sweep (in the code) stays within about 0.022 $ of zero for</w:t>
       </w:r>
       <w:r>
         <w:t xml:space="preserve"> </w:t>
@@ -10791,7 +10682,13 @@
           </m:dPr>
           <m:e>
             <m:r>
-              <m:t>0</m:t>
+              <m:rPr>
+                <m:sty m:val="p"/>
+              </m:rPr>
+              <m:t>−</m:t>
+            </m:r>
+            <m:r>
+              <m:t>0.08</m:t>
             </m:r>
             <m:r>
               <m:rPr>
@@ -10800,13 +10697,59 @@
               <m:t>,</m:t>
             </m:r>
             <m:r>
-              <m:t>0.06</m:t>
+              <m:t>0</m:t>
             </m:r>
           </m:e>
         </m:d>
       </m:oMath>
       <w:r>
-        <w:t xml:space="preserve">.</w:t>
+        <w:t xml:space="preserve"> </w:t>
+      </w:r>
+      <w:r>
+        <w:t xml:space="preserve">and falls steadily for</w:t>
+      </w:r>
+      <w:r>
+        <w:t xml:space="preserve"> </w:t>
+      </w:r>
+      <m:oMath>
+        <m:r>
+          <m:t>a</m:t>
+        </m:r>
+        <m:r>
+          <m:rPr>
+            <m:sty m:val="p"/>
+          </m:rPr>
+          <m:t>&gt;</m:t>
+        </m:r>
+        <m:r>
+          <m:t>0</m:t>
+        </m:r>
+      </m:oMath>
+      <w:r>
+        <w:t xml:space="preserve"> </w:t>
+      </w:r>
+      <w:r>
+        <w:t xml:space="preserve">(-0.29 $ at</w:t>
+      </w:r>
+      <w:r>
+        <w:t xml:space="preserve"> </w:t>
+      </w:r>
+      <m:oMath>
+        <m:r>
+          <m:t>a</m:t>
+        </m:r>
+        <m:r>
+          <m:rPr>
+            <m:sty m:val="p"/>
+          </m:rPr>
+          <m:t>=</m:t>
+        </m:r>
+        <m:r>
+          <m:t>0.08</m:t>
+        </m:r>
+      </m:oMath>
+      <w:r>
+        <w:t xml:space="preserve">). Exercising too early is costly; waiting a little longer is almost free.</w:t>
       </w:r>
     </w:p>
     <w:bookmarkEnd w:id="24"/>
@@ -10826,7 +10769,7 @@
       <w:r>
         <w:drawing>
           <wp:inline>
-            <wp:extent cx="6309360" cy="2523744"/>
+            <wp:extent cx="5303520" cy="2121408"/>
             <wp:effectExtent b="0" l="0" r="0" t="0"/>
             <wp:docPr descr="Figure 1. Exercise boundaries b/K against u=T-t for N=360: reference (blue), LS (orange) and selected NN (green); the N=180 reference is dashed. Panel (a) \delta=0, panel (b) \delta=0.0125. Curves are broken at the dividends (dotted)." title="" id="26" name="Picture"/>
             <a:graphic>
@@ -10847,7 +10790,7 @@
                   <pic:spPr bwMode="auto">
                     <a:xfrm>
                       <a:off x="0" y="0"/>
-                      <a:ext cx="6309360" cy="2523744"/>
+                      <a:ext cx="5303520" cy="2121408"/>
                     </a:xfrm>
                     <a:prstGeom prst="rect">
                       <a:avLst/>
@@ -11029,7 +10972,7 @@
       <w:r>
         <w:drawing>
           <wp:inline>
-            <wp:extent cx="3840480" cy="2353842"/>
+            <wp:extent cx="2926080" cy="1793403"/>
             <wp:effectExtent b="0" l="0" r="0" t="0"/>
             <wp:docPr descr="Figure 2. Case 3 around d_3 (|t-d_3|\le1/24). Right of the dotted line is before d_3 in calendar time; left is after. On the pre-dividend side the reference lies on the Part 1 bound K(1-e^{-r(d_3-t)})/(\delta K) (grey dashed); LS and NN lie below it, since the cap only limits them from above." title="" id="29" name="Picture"/>
             <a:graphic>
@@ -11050,7 +10993,7 @@
                   <pic:spPr bwMode="auto">
                     <a:xfrm>
                       <a:off x="0" y="0"/>
-                      <a:ext cx="3840480" cy="2353842"/>
+                      <a:ext cx="2926080" cy="1793403"/>
                     </a:xfrm>
                     <a:prstGeom prst="rect">
                       <a:avLst/>
@@ -11326,7 +11269,7 @@
         <w:t xml:space="preserve">python run_all.py</w:t>
       </w:r>
       <w:r>
-        <w:t xml:space="preserve">. It reproduces every table and figure (about 3 minutes); a full rerun gave identical outputs apart from the timing columns.</w:t>
+        <w:t xml:space="preserve">. Reproduces every table and figure in about 3 minutes; reruns are identical apart from timings.</w:t>
       </w:r>
     </w:p>
     <w:p>
@@ -11375,7 +11318,22 @@
         <w:t xml:space="preserve">fitted/*.json</w:t>
       </w:r>
       <w:r>
-        <w:t xml:space="preserve">.</w:t>
+        <w:t xml:space="preserve">. Run on Python 3.11 (README: 3.12);</w:t>
+      </w:r>
+      <w:r>
+        <w:t xml:space="preserve"> </w:t>
+      </w:r>
+      <w:r>
+        <w:rPr>
+          <w:rStyle w:val="VerbatimChar"/>
+        </w:rPr>
+        <w:t xml:space="preserve">--verify</w:t>
+      </w:r>
+      <w:r>
+        <w:t xml:space="preserve"> </w:t>
+      </w:r>
+      <w:r>
+        <w:t xml:space="preserve">still passed.</w:t>
       </w:r>
     </w:p>
     <w:p>
@@ -11415,7 +11373,7 @@
         <w:t xml:space="preserve"> </w:t>
       </w:r>
       <w:r>
-        <w:t xml:space="preserve">We used Claude (Anthropic; configured model identifier claude-opus-5-5, via Cowork) to draft code, derivations and text, and we verified its suggestions. One suggestion we checked computationally: integrating the piecewise-linear transition kernel exactly adds a spurious variance of</w:t>
+        <w:t xml:space="preserve">We used Claude (Anthropic; model identifier claude-opus-5-5, via Cowork) to draft code, derivations and text, and verified its suggestions. One we checked computationally: the piecewise-linear kernel of our cross-check solver adds a spurious variance</w:t>
       </w:r>
       <w:r>
         <w:t xml:space="preserve"> </w:t>
@@ -11450,7 +11408,21 @@
         <w:t xml:space="preserve"> </w:t>
       </w:r>
       <w:r>
-        <w:t xml:space="preserve">per step. Without the correction, European errors were about</w:t>
+        <w:t xml:space="preserve">per step. Without correcting it, European errors grew with</w:t>
+      </w:r>
+      <w:r>
+        <w:t xml:space="preserve"> </w:t>
+      </w:r>
+      <m:oMath>
+        <m:r>
+          <m:t>N</m:t>
+        </m:r>
+      </m:oMath>
+      <w:r>
+        <w:t xml:space="preserve"> </w:t>
+      </w:r>
+      <w:r>
+        <w:t xml:space="preserve">(about</w:t>
       </w:r>
       <w:r>
         <w:t xml:space="preserve"> </w:t>
@@ -11488,7 +11460,10 @@
         <w:t xml:space="preserve"> </w:t>
       </w:r>
       <w:r>
-        <w:t xml:space="preserve">(</w:t>
+        <w:t xml:space="preserve">at</w:t>
+      </w:r>
+      <w:r>
+        <w:t xml:space="preserve"> </w:t>
       </w:r>
       <m:oMath>
         <m:r>
@@ -11505,7 +11480,7 @@
         </m:r>
       </m:oMath>
       <w:r>
-        <w:t xml:space="preserve">) and</w:t>
+        <w:t xml:space="preserve">,</w:t>
       </w:r>
       <w:r>
         <w:t xml:space="preserve"> </w:t>
@@ -11543,7 +11518,10 @@
         <w:t xml:space="preserve"> </w:t>
       </w:r>
       <w:r>
-        <w:t xml:space="preserve">(</w:t>
+        <w:t xml:space="preserve">at</w:t>
+      </w:r>
+      <w:r>
+        <w:t xml:space="preserve"> </w:t>
       </w:r>
       <m:oMath>
         <m:r>
@@ -11560,18 +11538,7 @@
         </m:r>
       </m:oMath>
       <w:r>
-        <w:t xml:space="preserve">) and grew with</w:t>
-      </w:r>
-      <w:r>
-        <w:t xml:space="preserve"> </w:t>
-      </w:r>
-      <m:oMath>
-        <m:r>
-          <m:t>N</m:t>
-        </m:r>
-      </m:oMath>
-      <w:r>
-        <w:t xml:space="preserve">. With it, they fell to about</w:t>
+        <w:t xml:space="preserve">); with it they fell to about</w:t>
       </w:r>
       <w:r>
         <w:t xml:space="preserve"> </w:t>
@@ -11604,17 +11571,6 @@
             </m:r>
           </m:sup>
         </m:sSup>
-      </m:oMath>
-      <w:r>
-        <w:t xml:space="preserve">, independent of</w:t>
-      </w:r>
-      <w:r>
-        <w:t xml:space="preserve"> </w:t>
-      </w:r>
-      <m:oMath>
-        <m:r>
-          <m:t>N</m:t>
-        </m:r>
       </m:oMath>
       <w:r>
         <w:t xml:space="preserve">.</w:t>

</xml_diff>

<commit_message>
Final: Part 1 slides, contributions
</commit_message>
<xml_diff>
--- a/report.docx
+++ b/report.docx
@@ -1620,7 +1620,7 @@
         </m:r>
       </m:oMath>
       <w:r>
-        <w:t xml:space="preserve">. The reference satisfies the lower bound at every node.</w:t>
+        <w:t xml:space="preserve">. Our cross-check solver’s full value surface satisfies the lower bound at every node.</w:t>
       </w:r>
     </w:p>
     <w:p>
@@ -6571,7 +6571,7 @@
         <w:t xml:space="preserve"> </w:t>
       </w:r>
       <w:r>
-        <w:t xml:space="preserve">5 s supervised plus 41 s payoff training for all four cases, with 2 CPU threads, 1 inter-op thread and deterministic algorithms (README settings).</w:t>
+        <w:t xml:space="preserve">4 s supervised plus 41 s payoff training for all four cases, with 2 CPU threads, 1 inter-op thread and deterministic algorithms (README settings).</w:t>
       </w:r>
     </w:p>
     <w:p>

</xml_diff>